<commit_message>
spring boot and react examples
</commit_message>
<xml_diff>
--- a/Java Full Stack and React.docx
+++ b/Java Full Stack and React.docx
@@ -102,11 +102,19 @@
         </w:rPr>
         <w:t xml:space="preserve">REST </w:t>
       </w:r>
-      <w:r>
-        <w:rPr>
-          <w:highlight w:val="yellow"/>
-        </w:rPr>
-        <w:t>API’s in Spring Boot</w:t>
+      <w:proofErr w:type="gramStart"/>
+      <w:r>
+        <w:rPr>
+          <w:highlight w:val="yellow"/>
+        </w:rPr>
+        <w:t>API’s</w:t>
+      </w:r>
+      <w:proofErr w:type="gramEnd"/>
+      <w:r>
+        <w:rPr>
+          <w:highlight w:val="yellow"/>
+        </w:rPr>
+        <w:t xml:space="preserve"> in Spring Boot</w:t>
       </w:r>
     </w:p>
     <w:p>
@@ -183,8 +191,29 @@
       </w:r>
       <w:r>
         <w:lastRenderedPageBreak/>
-        <w:t xml:space="preserve">  public String test() { return “hello spring” }</w:t>
-      </w:r>
+        <w:t xml:space="preserve">  public String </w:t>
+      </w:r>
+      <w:proofErr w:type="gramStart"/>
+      <w:r>
+        <w:t>test(</w:t>
+      </w:r>
+      <w:proofErr w:type="gramEnd"/>
+      <w:r>
+        <w:t xml:space="preserve">) </w:t>
+      </w:r>
+      <w:proofErr w:type="gramStart"/>
+      <w:r>
+        <w:t>{ return</w:t>
+      </w:r>
+      <w:proofErr w:type="gramEnd"/>
+      <w:r>
+        <w:t xml:space="preserve"> “hello spring</w:t>
+      </w:r>
+      <w:proofErr w:type="gramStart"/>
+      <w:r>
+        <w:t>” }</w:t>
+      </w:r>
+      <w:proofErr w:type="gramEnd"/>
       <w:r>
         <w:br/>
         <w:t>}</w:t>
@@ -198,7 +227,21 @@
         <w:rPr>
           <w:highlight w:val="yellow"/>
         </w:rPr>
-        <w:t>In Spring Boot we have various annotations to perform the job for REST api</w:t>
+        <w:t xml:space="preserve">In Spring </w:t>
+      </w:r>
+      <w:proofErr w:type="gramStart"/>
+      <w:r>
+        <w:rPr>
+          <w:highlight w:val="yellow"/>
+        </w:rPr>
+        <w:t>Boot</w:t>
+      </w:r>
+      <w:proofErr w:type="gramEnd"/>
+      <w:r>
+        <w:rPr>
+          <w:highlight w:val="yellow"/>
+        </w:rPr>
+        <w:t xml:space="preserve"> we have various annotations to perform the job for REST api</w:t>
       </w:r>
     </w:p>
     <w:p>
@@ -267,8 +310,21 @@
           <w:numId w:val="3"/>
         </w:numPr>
       </w:pPr>
-      <w:r>
-        <w:t>Web -&gt; spring boot starter web : This gives all the features a web application must have</w:t>
+      <w:proofErr w:type="gramStart"/>
+      <w:r>
+        <w:t>Web -&gt; spring</w:t>
+      </w:r>
+      <w:proofErr w:type="gramEnd"/>
+      <w:r>
+        <w:t xml:space="preserve"> boot starter </w:t>
+      </w:r>
+      <w:proofErr w:type="gramStart"/>
+      <w:r>
+        <w:t>web :</w:t>
+      </w:r>
+      <w:proofErr w:type="gramEnd"/>
+      <w:r>
+        <w:t xml:space="preserve"> This gives all the features a web application must have</w:t>
       </w:r>
     </w:p>
     <w:p>
@@ -279,8 +335,26 @@
           <w:numId w:val="3"/>
         </w:numPr>
       </w:pPr>
-      <w:r>
-        <w:t>Jpa -&gt; spring boot data jpa : This gives all the features to connect with the DB</w:t>
+      <w:proofErr w:type="spellStart"/>
+      <w:r>
+        <w:t>Jpa</w:t>
+      </w:r>
+      <w:proofErr w:type="spellEnd"/>
+      <w:r>
+        <w:t xml:space="preserve"> -&gt; spring boot data </w:t>
+      </w:r>
+      <w:proofErr w:type="spellStart"/>
+      <w:proofErr w:type="gramStart"/>
+      <w:r>
+        <w:t>jpa</w:t>
+      </w:r>
+      <w:proofErr w:type="spellEnd"/>
+      <w:r>
+        <w:t xml:space="preserve"> :</w:t>
+      </w:r>
+      <w:proofErr w:type="gramEnd"/>
+      <w:r>
+        <w:t xml:space="preserve"> This gives all the features to connect with the DB</w:t>
       </w:r>
     </w:p>
     <w:p>
@@ -291,8 +365,13 @@
           <w:numId w:val="3"/>
         </w:numPr>
       </w:pPr>
-      <w:r>
-        <w:t>Actuator -&gt; spring boot actuator: This gives all the features required to monitor the application in the production</w:t>
+      <w:proofErr w:type="gramStart"/>
+      <w:r>
+        <w:t>Actuator -&gt; spring</w:t>
+      </w:r>
+      <w:proofErr w:type="gramEnd"/>
+      <w:r>
+        <w:t xml:space="preserve"> boot actuator: This gives all the features required to monitor the application in the production</w:t>
       </w:r>
     </w:p>
     <w:p/>
@@ -422,8 +501,16 @@
         <w:rPr>
           <w:highlight w:val="yellow"/>
         </w:rPr>
-        <w:t>Add dependency devtools</w:t>
-      </w:r>
+        <w:t xml:space="preserve">Add dependency </w:t>
+      </w:r>
+      <w:proofErr w:type="spellStart"/>
+      <w:r>
+        <w:rPr>
+          <w:highlight w:val="yellow"/>
+        </w:rPr>
+        <w:t>devtools</w:t>
+      </w:r>
+      <w:proofErr w:type="spellEnd"/>
     </w:p>
     <w:p>
       <w:pPr>
@@ -625,7 +712,21 @@
         <w:rPr>
           <w:highlight w:val="yellow"/>
         </w:rPr>
-        <w:t xml:space="preserve">Can we use same URL’s for </w:t>
+        <w:t xml:space="preserve">Can we use same </w:t>
+      </w:r>
+      <w:proofErr w:type="gramStart"/>
+      <w:r>
+        <w:rPr>
+          <w:highlight w:val="yellow"/>
+        </w:rPr>
+        <w:t>URL’s</w:t>
+      </w:r>
+      <w:proofErr w:type="gramEnd"/>
+      <w:r>
+        <w:rPr>
+          <w:highlight w:val="yellow"/>
+        </w:rPr>
+        <w:t xml:space="preserve"> for </w:t>
       </w:r>
       <w:r>
         <w:rPr>
@@ -892,18 +993,39 @@
         <w:ind w:left="0" w:firstLine="0"/>
       </w:pPr>
       <w:r>
-        <w:t xml:space="preserve">These are the parameter you pass in the URL in key &amp; value pair, </w:t>
-      </w:r>
-      <w:r>
-        <w:t>you use after ?</w:t>
-      </w:r>
-    </w:p>
-    <w:p>
-      <w:pPr>
-        <w:ind w:left="0" w:firstLine="0"/>
-      </w:pPr>
-      <w:r>
-        <w:t>url = someURL?id=100&amp;name=Ajay</w:t>
+        <w:t xml:space="preserve">These are the parameter you pass in the URL in key &amp; value </w:t>
+      </w:r>
+      <w:proofErr w:type="gramStart"/>
+      <w:r>
+        <w:t>pair,</w:t>
+      </w:r>
+      <w:proofErr w:type="gramEnd"/>
+      <w:r>
+        <w:t xml:space="preserve"> </w:t>
+      </w:r>
+      <w:r>
+        <w:t xml:space="preserve">you use </w:t>
+      </w:r>
+      <w:proofErr w:type="gramStart"/>
+      <w:r>
+        <w:t>after ?</w:t>
+      </w:r>
+      <w:proofErr w:type="gramEnd"/>
+    </w:p>
+    <w:p>
+      <w:pPr>
+        <w:ind w:left="0" w:firstLine="0"/>
+      </w:pPr>
+      <w:r>
+        <w:t xml:space="preserve">url = </w:t>
+      </w:r>
+      <w:proofErr w:type="spellStart"/>
+      <w:r>
+        <w:t>someURL?id</w:t>
+      </w:r>
+      <w:proofErr w:type="spellEnd"/>
+      <w:r>
+        <w:t>=100&amp;name=Ajay</w:t>
       </w:r>
     </w:p>
     <w:p>
@@ -1019,7 +1141,23 @@
         <w:t>Note:</w:t>
       </w:r>
       <w:r>
-        <w:t xml:space="preserve"> RequestParameter are optional parameters, you can use them when data’s are not mandatory.</w:t>
+        <w:t xml:space="preserve"> </w:t>
+      </w:r>
+      <w:proofErr w:type="spellStart"/>
+      <w:r>
+        <w:t>RequestParameter</w:t>
+      </w:r>
+      <w:proofErr w:type="spellEnd"/>
+      <w:r>
+        <w:t xml:space="preserve"> are optional parameters, you can use them when </w:t>
+      </w:r>
+      <w:proofErr w:type="gramStart"/>
+      <w:r>
+        <w:t>data’s</w:t>
+      </w:r>
+      <w:proofErr w:type="gramEnd"/>
+      <w:r>
+        <w:t xml:space="preserve"> are not mandatory.</w:t>
       </w:r>
     </w:p>
     <w:p>
@@ -1047,7 +1185,15 @@
         <w:t>@RequestBody:</w:t>
       </w:r>
       <w:r>
-        <w:t xml:space="preserve"> It is used to extract the data from the request body, it needs a Java class to be mapped so that each property in the data maps to the object property</w:t>
+        <w:t xml:space="preserve"> It is used to extract the data from the request </w:t>
+      </w:r>
+      <w:proofErr w:type="gramStart"/>
+      <w:r>
+        <w:t>body,</w:t>
+      </w:r>
+      <w:proofErr w:type="gramEnd"/>
+      <w:r>
+        <w:t xml:space="preserve"> it needs a Java class to be mapped so that each property in the data maps to the object property</w:t>
       </w:r>
     </w:p>
     <w:p>
@@ -1562,8 +1708,16 @@
         <w:rPr>
           <w:highlight w:val="yellow"/>
         </w:rPr>
-        <w:t>application.properties/application.yaml</w:t>
-      </w:r>
+        <w:t>application.properties/</w:t>
+      </w:r>
+      <w:proofErr w:type="spellStart"/>
+      <w:r>
+        <w:rPr>
+          <w:highlight w:val="yellow"/>
+        </w:rPr>
+        <w:t>application.yaml</w:t>
+      </w:r>
+      <w:proofErr w:type="spellEnd"/>
     </w:p>
     <w:p>
       <w:pPr>
@@ -1615,12 +1769,14 @@
       <w:pPr>
         <w:ind w:left="0" w:firstLine="0"/>
       </w:pPr>
+      <w:proofErr w:type="spellStart"/>
       <w:r>
         <w:rPr>
           <w:highlight w:val="yellow"/>
         </w:rPr>
         <w:t>application.yml</w:t>
       </w:r>
+      <w:proofErr w:type="spellEnd"/>
     </w:p>
     <w:p>
       <w:pPr>
@@ -1699,8 +1855,13 @@
           <w:numId w:val="7"/>
         </w:numPr>
       </w:pPr>
-      <w:r>
-        <w:t>ProfileRepo extends JpaRepository</w:t>
+      <w:proofErr w:type="spellStart"/>
+      <w:r>
+        <w:t>ProfileRepo</w:t>
+      </w:r>
+      <w:proofErr w:type="spellEnd"/>
+      <w:r>
+        <w:t xml:space="preserve"> extends JpaRepository</w:t>
       </w:r>
     </w:p>
     <w:p>
@@ -1712,7 +1873,15 @@
         </w:numPr>
       </w:pPr>
       <w:r>
-        <w:t>ProfileServiceImpl - methods that invoke ProfileRepo methods</w:t>
+        <w:t xml:space="preserve">ProfileServiceImpl - methods that invoke </w:t>
+      </w:r>
+      <w:proofErr w:type="spellStart"/>
+      <w:r>
+        <w:t>ProfileRepo</w:t>
+      </w:r>
+      <w:proofErr w:type="spellEnd"/>
+      <w:r>
+        <w:t xml:space="preserve"> methods</w:t>
       </w:r>
       <w:r>
         <w:t xml:space="preserve"> it must implement an interface that is given to the Controller</w:t>
@@ -1738,8 +1907,13 @@
           <w:numId w:val="7"/>
         </w:numPr>
       </w:pPr>
-      <w:r>
-        <w:t>RestApi - controller</w:t>
+      <w:proofErr w:type="spellStart"/>
+      <w:r>
+        <w:t>RestApi</w:t>
+      </w:r>
+      <w:proofErr w:type="spellEnd"/>
+      <w:r>
+        <w:t xml:space="preserve"> - controller</w:t>
       </w:r>
     </w:p>
     <w:p>
@@ -1804,7 +1978,15 @@
         <w:ind w:left="0" w:firstLine="0"/>
       </w:pPr>
       <w:r>
-        <w:t>Create a ProfileRepo that extends JpaRepository&lt;Profile, Integer&gt;</w:t>
+        <w:t xml:space="preserve">Create a </w:t>
+      </w:r>
+      <w:proofErr w:type="spellStart"/>
+      <w:r>
+        <w:t>ProfileRepo</w:t>
+      </w:r>
+      <w:proofErr w:type="spellEnd"/>
+      <w:r>
+        <w:t xml:space="preserve"> that extends JpaRepository&lt;Profile, Integer&gt;</w:t>
       </w:r>
     </w:p>
     <w:p>
@@ -1961,6 +2143,9 @@
         <w:ind w:left="0" w:firstLine="0"/>
       </w:pPr>
       <w:r>
+        <w:rPr>
+          <w:noProof/>
+        </w:rPr>
         <w:lastRenderedPageBreak/>
         <w:drawing>
           <wp:inline distT="0" distB="0" distL="0" distR="0" wp14:anchorId="3A2FA6EF" wp14:editId="0584E2E1">
@@ -2119,6 +2304,9 @@
         <w:ind w:left="0" w:firstLine="0"/>
       </w:pPr>
       <w:r>
+        <w:rPr>
+          <w:noProof/>
+        </w:rPr>
         <w:lastRenderedPageBreak/>
         <w:drawing>
           <wp:inline distT="0" distB="0" distL="0" distR="0" wp14:anchorId="16A86072" wp14:editId="095DD291">
@@ -2196,9 +2384,11 @@
           <w:numId w:val="9"/>
         </w:numPr>
       </w:pPr>
+      <w:proofErr w:type="spellStart"/>
       <w:r>
         <w:t>ContactRepository</w:t>
       </w:r>
+      <w:proofErr w:type="spellEnd"/>
     </w:p>
     <w:p>
       <w:pPr>
@@ -2208,9 +2398,11 @@
           <w:numId w:val="9"/>
         </w:numPr>
       </w:pPr>
+      <w:proofErr w:type="spellStart"/>
       <w:r>
         <w:t>ContactService</w:t>
       </w:r>
+      <w:proofErr w:type="spellEnd"/>
     </w:p>
     <w:p>
       <w:pPr>
@@ -2229,6 +2421,9 @@
         <w:ind w:left="0" w:firstLine="0"/>
       </w:pPr>
       <w:r>
+        <w:rPr>
+          <w:noProof/>
+        </w:rPr>
         <w:drawing>
           <wp:inline distT="0" distB="0" distL="0" distR="0" wp14:anchorId="7B7B5BB4" wp14:editId="2C3D99EF">
             <wp:extent cx="5943600" cy="2643505"/>
@@ -2310,14 +2505,42 @@
           <w:color w:val="EE0000"/>
         </w:rPr>
         <w:br/>
-        <w:t xml:space="preserve">   @JoinColumn(name=”profileref”)</w:t>
-      </w:r>
+        <w:t xml:space="preserve">   @JoinColumn(name</w:t>
+      </w:r>
+      <w:proofErr w:type="gramStart"/>
       <w:r>
         <w:rPr>
           <w:color w:val="EE0000"/>
         </w:rPr>
+        <w:t>=”profileref</w:t>
+      </w:r>
+      <w:proofErr w:type="gramEnd"/>
+      <w:r>
+        <w:rPr>
+          <w:color w:val="EE0000"/>
+        </w:rPr>
+        <w:t>”)</w:t>
+      </w:r>
+      <w:r>
+        <w:rPr>
+          <w:color w:val="EE0000"/>
+        </w:rPr>
         <w:br/>
-        <w:t xml:space="preserve">   List&lt;Contact&gt; contactList;</w:t>
+        <w:t xml:space="preserve">   List&lt;Contact&gt; </w:t>
+      </w:r>
+      <w:proofErr w:type="spellStart"/>
+      <w:r>
+        <w:rPr>
+          <w:color w:val="EE0000"/>
+        </w:rPr>
+        <w:t>contactList</w:t>
+      </w:r>
+      <w:proofErr w:type="spellEnd"/>
+      <w:r>
+        <w:rPr>
+          <w:color w:val="EE0000"/>
+        </w:rPr>
+        <w:t>;</w:t>
       </w:r>
       <w:r>
         <w:br/>
@@ -2351,15 +2574,37 @@
         <w:rPr>
           <w:color w:val="EE0000"/>
         </w:rPr>
-        <w:t>@Column(name=”profileref”)</w:t>
-      </w:r>
+        <w:t>@Column(name</w:t>
+      </w:r>
+      <w:proofErr w:type="gramStart"/>
       <w:r>
         <w:rPr>
           <w:color w:val="EE0000"/>
         </w:rPr>
+        <w:t>=”profileref</w:t>
+      </w:r>
+      <w:proofErr w:type="gramEnd"/>
+      <w:r>
+        <w:rPr>
+          <w:color w:val="EE0000"/>
+        </w:rPr>
+        <w:t>”)</w:t>
+      </w:r>
+      <w:r>
+        <w:rPr>
+          <w:color w:val="EE0000"/>
+        </w:rPr>
         <w:br/>
-        <w:t xml:space="preserve">  int profileRef</w:t>
-      </w:r>
+        <w:t xml:space="preserve">  int </w:t>
+      </w:r>
+      <w:proofErr w:type="spellStart"/>
+      <w:r>
+        <w:rPr>
+          <w:color w:val="EE0000"/>
+        </w:rPr>
+        <w:t>profileRef</w:t>
+      </w:r>
+      <w:proofErr w:type="spellEnd"/>
       <w:r>
         <w:t>;</w:t>
       </w:r>
@@ -2384,6 +2629,9 @@
         <w:ind w:left="0" w:firstLine="0"/>
       </w:pPr>
       <w:r>
+        <w:rPr>
+          <w:noProof/>
+        </w:rPr>
         <w:lastRenderedPageBreak/>
         <w:drawing>
           <wp:inline distT="0" distB="0" distL="0" distR="0" wp14:anchorId="6D71661E" wp14:editId="646A224F">
@@ -2426,18 +2674,23 @@
       <w:pPr>
         <w:ind w:left="0" w:firstLine="0"/>
       </w:pPr>
+      <w:proofErr w:type="spellStart"/>
       <w:r>
         <w:rPr>
           <w:highlight w:val="yellow"/>
         </w:rPr>
         <w:t>ContactRepository</w:t>
       </w:r>
-    </w:p>
-    <w:p>
-      <w:pPr>
-        <w:ind w:left="0" w:firstLine="0"/>
-      </w:pPr>
-      <w:r>
+      <w:proofErr w:type="spellEnd"/>
+    </w:p>
+    <w:p>
+      <w:pPr>
+        <w:ind w:left="0" w:firstLine="0"/>
+      </w:pPr>
+      <w:r>
+        <w:rPr>
+          <w:noProof/>
+        </w:rPr>
         <w:drawing>
           <wp:inline distT="0" distB="0" distL="0" distR="0" wp14:anchorId="44D487B4" wp14:editId="10AF4982">
             <wp:extent cx="5943600" cy="2219325"/>
@@ -2487,18 +2740,23 @@
       <w:pPr>
         <w:ind w:left="0" w:firstLine="0"/>
       </w:pPr>
+      <w:proofErr w:type="spellStart"/>
       <w:r>
         <w:rPr>
           <w:highlight w:val="yellow"/>
         </w:rPr>
         <w:t>ContactServiceImpl</w:t>
       </w:r>
-    </w:p>
-    <w:p>
-      <w:pPr>
-        <w:ind w:left="0" w:firstLine="0"/>
-      </w:pPr>
-      <w:r>
+      <w:proofErr w:type="spellEnd"/>
+    </w:p>
+    <w:p>
+      <w:pPr>
+        <w:ind w:left="0" w:firstLine="0"/>
+      </w:pPr>
+      <w:r>
+        <w:rPr>
+          <w:noProof/>
+        </w:rPr>
         <w:lastRenderedPageBreak/>
         <w:drawing>
           <wp:inline distT="0" distB="0" distL="0" distR="0" wp14:anchorId="1900AB1F" wp14:editId="668B8580">
@@ -2553,6 +2811,9 @@
         <w:ind w:left="0" w:firstLine="0"/>
       </w:pPr>
       <w:r>
+        <w:rPr>
+          <w:noProof/>
+        </w:rPr>
         <w:lastRenderedPageBreak/>
         <w:drawing>
           <wp:inline distT="0" distB="0" distL="0" distR="0" wp14:anchorId="5FF32058" wp14:editId="5DBDF934">
@@ -2626,6 +2887,9 @@
         <w:ind w:left="0" w:firstLine="0"/>
       </w:pPr>
       <w:r>
+        <w:rPr>
+          <w:noProof/>
+        </w:rPr>
         <w:lastRenderedPageBreak/>
         <w:drawing>
           <wp:inline distT="0" distB="0" distL="0" distR="0" wp14:anchorId="2CC144D7" wp14:editId="5F6F6AEC">
@@ -2680,6 +2944,9 @@
         <w:ind w:left="0" w:firstLine="0"/>
       </w:pPr>
       <w:r>
+        <w:rPr>
+          <w:noProof/>
+        </w:rPr>
         <w:drawing>
           <wp:inline distT="0" distB="0" distL="0" distR="0" wp14:anchorId="30907362" wp14:editId="4F52E39F">
             <wp:extent cx="5943600" cy="3536950"/>
@@ -2750,7 +3017,15 @@
         </w:numPr>
       </w:pPr>
       <w:r>
-        <w:t>searchContacts -&gt; this must search the contacts of a profile based on the name, that returns list of contacts starting with  some letters</w:t>
+        <w:t xml:space="preserve">searchContacts -&gt; this must search the contacts of a profile based on the name, that returns list of contacts starting </w:t>
+      </w:r>
+      <w:proofErr w:type="gramStart"/>
+      <w:r>
+        <w:t>with  some</w:t>
+      </w:r>
+      <w:proofErr w:type="gramEnd"/>
+      <w:r>
+        <w:t xml:space="preserve"> letters</w:t>
       </w:r>
     </w:p>
     <w:p>
@@ -2770,8 +3045,13 @@
           <w:numId w:val="10"/>
         </w:numPr>
       </w:pPr>
-      <w:r>
-        <w:t>deleteContact -&gt; delete the contact for a particular contact-id</w:t>
+      <w:proofErr w:type="spellStart"/>
+      <w:r>
+        <w:t>deleteContact</w:t>
+      </w:r>
+      <w:proofErr w:type="spellEnd"/>
+      <w:r>
+        <w:t xml:space="preserve"> -&gt; delete the contact for a particular contact-id</w:t>
       </w:r>
     </w:p>
     <w:p>
@@ -2782,9 +3062,1380 @@
           <w:numId w:val="10"/>
         </w:numPr>
       </w:pPr>
-      <w:r>
-        <w:t>updateContact -&gt; update the phone number based on the contact-id</w:t>
-      </w:r>
+      <w:proofErr w:type="spellStart"/>
+      <w:r>
+        <w:t>updateContact</w:t>
+      </w:r>
+      <w:proofErr w:type="spellEnd"/>
+      <w:r>
+        <w:t xml:space="preserve"> -&gt; update the phone number based on the contact-id</w:t>
+      </w:r>
+    </w:p>
+    <w:p>
+      <w:pPr>
+        <w:ind w:left="0" w:firstLine="0"/>
+      </w:pPr>
+      <w:r>
+        <w:rPr>
+          <w:highlight w:val="yellow"/>
+        </w:rPr>
+        <w:t>Creating an authenticate method to accept id and password and return profile or profile not found exception</w:t>
+      </w:r>
+    </w:p>
+    <w:p>
+      <w:pPr>
+        <w:ind w:left="0" w:firstLine="0"/>
+      </w:pPr>
+      <w:r>
+        <w:rPr>
+          <w:highlight w:val="yellow"/>
+        </w:rPr>
+        <w:t>JPQL Derived Query methods</w:t>
+      </w:r>
+    </w:p>
+    <w:p>
+      <w:pPr>
+        <w:ind w:left="0" w:firstLine="0"/>
+      </w:pPr>
+      <w:r>
+        <w:t xml:space="preserve">It is a Spring data JPA feature where JPQL queries are automatically generated by parsing the repository method names, it follows a naming convention i.e., </w:t>
+      </w:r>
+      <w:proofErr w:type="spellStart"/>
+      <w:r>
+        <w:t>findByProperty</w:t>
+      </w:r>
+      <w:proofErr w:type="spellEnd"/>
+      <w:r>
+        <w:t xml:space="preserve">, </w:t>
+      </w:r>
+      <w:proofErr w:type="spellStart"/>
+      <w:r>
+        <w:t>findByPropertyAnProperty</w:t>
+      </w:r>
+      <w:proofErr w:type="spellEnd"/>
+      <w:r>
+        <w:t xml:space="preserve">, </w:t>
+      </w:r>
+      <w:proofErr w:type="spellStart"/>
+      <w:r>
+        <w:t>findByPropertyOrProperty</w:t>
+      </w:r>
+      <w:proofErr w:type="spellEnd"/>
+      <w:r>
+        <w:t xml:space="preserve"> and so on</w:t>
+      </w:r>
+    </w:p>
+    <w:p>
+      <w:pPr>
+        <w:ind w:left="0" w:firstLine="0"/>
+      </w:pPr>
+      <w:r>
+        <w:drawing>
+          <wp:inline distT="0" distB="0" distL="0" distR="0" wp14:anchorId="55D653B4" wp14:editId="50408804">
+            <wp:extent cx="5943600" cy="2033270"/>
+            <wp:effectExtent l="0" t="0" r="0" b="5080"/>
+            <wp:docPr id="1420053074" name="Picture 1"/>
+            <wp:cNvGraphicFramePr>
+              <a:graphicFrameLocks xmlns:a="http://schemas.openxmlformats.org/drawingml/2006/main" noChangeAspect="1"/>
+            </wp:cNvGraphicFramePr>
+            <a:graphic xmlns:a="http://schemas.openxmlformats.org/drawingml/2006/main">
+              <a:graphicData uri="http://schemas.openxmlformats.org/drawingml/2006/picture">
+                <pic:pic xmlns:pic="http://schemas.openxmlformats.org/drawingml/2006/picture">
+                  <pic:nvPicPr>
+                    <pic:cNvPr id="1420053074" name=""/>
+                    <pic:cNvPicPr/>
+                  </pic:nvPicPr>
+                  <pic:blipFill>
+                    <a:blip r:embed="rId36"/>
+                    <a:stretch>
+                      <a:fillRect/>
+                    </a:stretch>
+                  </pic:blipFill>
+                  <pic:spPr>
+                    <a:xfrm>
+                      <a:off x="0" y="0"/>
+                      <a:ext cx="5943600" cy="2033270"/>
+                    </a:xfrm>
+                    <a:prstGeom prst="rect">
+                      <a:avLst/>
+                    </a:prstGeom>
+                  </pic:spPr>
+                </pic:pic>
+              </a:graphicData>
+            </a:graphic>
+          </wp:inline>
+        </w:drawing>
+      </w:r>
+    </w:p>
+    <w:p>
+      <w:pPr>
+        <w:ind w:left="0" w:firstLine="0"/>
+      </w:pPr>
+      <w:r>
+        <w:rPr>
+          <w:highlight w:val="yellow"/>
+        </w:rPr>
+        <w:t>ProfileNotFoundException.java</w:t>
+      </w:r>
+    </w:p>
+    <w:p>
+      <w:pPr>
+        <w:ind w:left="0" w:firstLine="0"/>
+      </w:pPr>
+      <w:r>
+        <w:lastRenderedPageBreak/>
+        <w:drawing>
+          <wp:inline distT="0" distB="0" distL="0" distR="0" wp14:anchorId="659ED83D" wp14:editId="18D703EF">
+            <wp:extent cx="5943600" cy="2729230"/>
+            <wp:effectExtent l="0" t="0" r="0" b="0"/>
+            <wp:docPr id="2035973942" name="Picture 1"/>
+            <wp:cNvGraphicFramePr>
+              <a:graphicFrameLocks xmlns:a="http://schemas.openxmlformats.org/drawingml/2006/main" noChangeAspect="1"/>
+            </wp:cNvGraphicFramePr>
+            <a:graphic xmlns:a="http://schemas.openxmlformats.org/drawingml/2006/main">
+              <a:graphicData uri="http://schemas.openxmlformats.org/drawingml/2006/picture">
+                <pic:pic xmlns:pic="http://schemas.openxmlformats.org/drawingml/2006/picture">
+                  <pic:nvPicPr>
+                    <pic:cNvPr id="2035973942" name=""/>
+                    <pic:cNvPicPr/>
+                  </pic:nvPicPr>
+                  <pic:blipFill>
+                    <a:blip r:embed="rId37"/>
+                    <a:stretch>
+                      <a:fillRect/>
+                    </a:stretch>
+                  </pic:blipFill>
+                  <pic:spPr>
+                    <a:xfrm>
+                      <a:off x="0" y="0"/>
+                      <a:ext cx="5943600" cy="2729230"/>
+                    </a:xfrm>
+                    <a:prstGeom prst="rect">
+                      <a:avLst/>
+                    </a:prstGeom>
+                  </pic:spPr>
+                </pic:pic>
+              </a:graphicData>
+            </a:graphic>
+          </wp:inline>
+        </w:drawing>
+      </w:r>
+      <w:r>
+        <w:t xml:space="preserve"> </w:t>
+      </w:r>
+    </w:p>
+    <w:p>
+      <w:pPr>
+        <w:ind w:left="0" w:firstLine="0"/>
+      </w:pPr>
+      <w:r>
+        <w:rPr>
+          <w:highlight w:val="yellow"/>
+        </w:rPr>
+        <w:t>Optional&lt;T&gt;:</w:t>
+      </w:r>
+      <w:r>
+        <w:t xml:space="preserve"> </w:t>
+      </w:r>
+    </w:p>
+    <w:p>
+      <w:pPr>
+        <w:ind w:left="0" w:firstLine="0"/>
+      </w:pPr>
+      <w:r>
+        <w:t xml:space="preserve">It is used to represent the presence or absence of a value, this avoids </w:t>
+      </w:r>
+      <w:proofErr w:type="spellStart"/>
+      <w:r>
+        <w:t>NullPointerException</w:t>
+      </w:r>
+      <w:proofErr w:type="spellEnd"/>
+      <w:r>
+        <w:t>.</w:t>
+      </w:r>
+    </w:p>
+    <w:p>
+      <w:pPr>
+        <w:ind w:left="0" w:firstLine="0"/>
+      </w:pPr>
+      <w:r>
+        <w:rPr>
+          <w:highlight w:val="yellow"/>
+        </w:rPr>
+        <w:t>Before Java 8 or Optional</w:t>
+      </w:r>
+    </w:p>
+    <w:p>
+      <w:pPr>
+        <w:ind w:left="0" w:firstLine="0"/>
+      </w:pPr>
+      <w:r>
+        <w:t xml:space="preserve">Profile </w:t>
+      </w:r>
+      <w:proofErr w:type="spellStart"/>
+      <w:r>
+        <w:t>profile</w:t>
+      </w:r>
+      <w:proofErr w:type="spellEnd"/>
+      <w:r>
+        <w:t xml:space="preserve"> = </w:t>
+      </w:r>
+      <w:proofErr w:type="spellStart"/>
+      <w:proofErr w:type="gramStart"/>
+      <w:r>
+        <w:t>service.findById</w:t>
+      </w:r>
+      <w:proofErr w:type="spellEnd"/>
+      <w:proofErr w:type="gramEnd"/>
+      <w:r>
+        <w:t>(id);</w:t>
+      </w:r>
+      <w:r>
+        <w:br/>
+        <w:t xml:space="preserve">String password = </w:t>
+      </w:r>
+      <w:proofErr w:type="spellStart"/>
+      <w:proofErr w:type="gramStart"/>
+      <w:r>
+        <w:t>profile.getPassword</w:t>
+      </w:r>
+      <w:proofErr w:type="spellEnd"/>
+      <w:proofErr w:type="gramEnd"/>
+      <w:r>
+        <w:t xml:space="preserve">(); // throw </w:t>
+      </w:r>
+      <w:proofErr w:type="spellStart"/>
+      <w:r>
+        <w:t>NullPointerExcepiton</w:t>
+      </w:r>
+      <w:proofErr w:type="spellEnd"/>
+    </w:p>
+    <w:p>
+      <w:pPr>
+        <w:ind w:left="0" w:firstLine="0"/>
+      </w:pPr>
+      <w:proofErr w:type="gramStart"/>
+      <w:r>
+        <w:t>if(profile !</w:t>
+      </w:r>
+      <w:proofErr w:type="gramEnd"/>
+      <w:r>
+        <w:t xml:space="preserve">= null) </w:t>
+      </w:r>
+      <w:proofErr w:type="gramStart"/>
+      <w:r>
+        <w:t>{ String</w:t>
+      </w:r>
+      <w:proofErr w:type="gramEnd"/>
+      <w:r>
+        <w:t xml:space="preserve"> password = </w:t>
+      </w:r>
+      <w:proofErr w:type="spellStart"/>
+      <w:proofErr w:type="gramStart"/>
+      <w:r>
+        <w:t>profile.getPassword</w:t>
+      </w:r>
+      <w:proofErr w:type="spellEnd"/>
+      <w:proofErr w:type="gramEnd"/>
+      <w:r>
+        <w:t>(</w:t>
+      </w:r>
+      <w:proofErr w:type="gramStart"/>
+      <w:r>
+        <w:t>) }</w:t>
+      </w:r>
+      <w:proofErr w:type="gramEnd"/>
+      <w:r>
+        <w:br/>
+        <w:t xml:space="preserve">else </w:t>
+      </w:r>
+      <w:proofErr w:type="gramStart"/>
+      <w:r>
+        <w:t>{ throw</w:t>
+      </w:r>
+      <w:proofErr w:type="gramEnd"/>
+      <w:r>
+        <w:t xml:space="preserve"> new </w:t>
+      </w:r>
+      <w:proofErr w:type="spellStart"/>
+      <w:proofErr w:type="gramStart"/>
+      <w:r>
+        <w:t>ProfileNotFoundException</w:t>
+      </w:r>
+      <w:proofErr w:type="spellEnd"/>
+      <w:r>
+        <w:t>(</w:t>
+      </w:r>
+      <w:proofErr w:type="gramEnd"/>
+      <w:r>
+        <w:t>…</w:t>
+      </w:r>
+      <w:proofErr w:type="gramStart"/>
+      <w:r>
+        <w:t>) }</w:t>
+      </w:r>
+      <w:proofErr w:type="gramEnd"/>
+    </w:p>
+    <w:p>
+      <w:pPr>
+        <w:ind w:left="0" w:firstLine="0"/>
+      </w:pPr>
+      <w:r>
+        <w:rPr>
+          <w:highlight w:val="yellow"/>
+        </w:rPr>
+        <w:t>With Optional</w:t>
+      </w:r>
+    </w:p>
+    <w:p>
+      <w:pPr>
+        <w:ind w:left="0" w:firstLine="0"/>
+      </w:pPr>
+      <w:r>
+        <w:t xml:space="preserve">Profile p = </w:t>
+      </w:r>
+      <w:proofErr w:type="spellStart"/>
+      <w:proofErr w:type="gramStart"/>
+      <w:r>
+        <w:t>service.findById</w:t>
+      </w:r>
+      <w:proofErr w:type="spellEnd"/>
+      <w:proofErr w:type="gramEnd"/>
+      <w:r>
+        <w:t>(id</w:t>
+      </w:r>
+      <w:proofErr w:type="gramStart"/>
+      <w:r>
+        <w:t>).</w:t>
+      </w:r>
+      <w:proofErr w:type="spellStart"/>
+      <w:r>
+        <w:t>orElse</w:t>
+      </w:r>
+      <w:proofErr w:type="spellEnd"/>
+      <w:proofErr w:type="gramEnd"/>
+      <w:r>
+        <w:t xml:space="preserve">(() -&gt; new </w:t>
+      </w:r>
+      <w:proofErr w:type="spellStart"/>
+      <w:proofErr w:type="gramStart"/>
+      <w:r>
+        <w:t>ProfileNotFoundException</w:t>
+      </w:r>
+      <w:proofErr w:type="spellEnd"/>
+      <w:r>
+        <w:t>() }</w:t>
+      </w:r>
+      <w:proofErr w:type="gramEnd"/>
+      <w:r>
+        <w:br/>
+        <w:t xml:space="preserve">String password = </w:t>
+      </w:r>
+      <w:proofErr w:type="spellStart"/>
+      <w:proofErr w:type="gramStart"/>
+      <w:r>
+        <w:t>p.getPassword</w:t>
+      </w:r>
+      <w:proofErr w:type="spellEnd"/>
+      <w:proofErr w:type="gramEnd"/>
+      <w:r>
+        <w:t>();</w:t>
+      </w:r>
+    </w:p>
+    <w:p>
+      <w:pPr>
+        <w:ind w:left="0" w:firstLine="0"/>
+      </w:pPr>
+      <w:r>
+        <w:rPr>
+          <w:highlight w:val="yellow"/>
+        </w:rPr>
+        <w:t>ProfileServiceImpl.java</w:t>
+      </w:r>
+    </w:p>
+    <w:p>
+      <w:pPr>
+        <w:ind w:left="0" w:firstLine="0"/>
+      </w:pPr>
+      <w:r>
+        <w:lastRenderedPageBreak/>
+        <w:drawing>
+          <wp:inline distT="0" distB="0" distL="0" distR="0" wp14:anchorId="37F3B1C7" wp14:editId="6745EF8A">
+            <wp:extent cx="5943600" cy="3752850"/>
+            <wp:effectExtent l="0" t="0" r="0" b="0"/>
+            <wp:docPr id="1628897172" name="Picture 1"/>
+            <wp:cNvGraphicFramePr>
+              <a:graphicFrameLocks xmlns:a="http://schemas.openxmlformats.org/drawingml/2006/main" noChangeAspect="1"/>
+            </wp:cNvGraphicFramePr>
+            <a:graphic xmlns:a="http://schemas.openxmlformats.org/drawingml/2006/main">
+              <a:graphicData uri="http://schemas.openxmlformats.org/drawingml/2006/picture">
+                <pic:pic xmlns:pic="http://schemas.openxmlformats.org/drawingml/2006/picture">
+                  <pic:nvPicPr>
+                    <pic:cNvPr id="1628897172" name=""/>
+                    <pic:cNvPicPr/>
+                  </pic:nvPicPr>
+                  <pic:blipFill>
+                    <a:blip r:embed="rId38"/>
+                    <a:stretch>
+                      <a:fillRect/>
+                    </a:stretch>
+                  </pic:blipFill>
+                  <pic:spPr>
+                    <a:xfrm>
+                      <a:off x="0" y="0"/>
+                      <a:ext cx="5943600" cy="3752850"/>
+                    </a:xfrm>
+                    <a:prstGeom prst="rect">
+                      <a:avLst/>
+                    </a:prstGeom>
+                  </pic:spPr>
+                </pic:pic>
+              </a:graphicData>
+            </a:graphic>
+          </wp:inline>
+        </w:drawing>
+      </w:r>
+    </w:p>
+    <w:p>
+      <w:pPr>
+        <w:ind w:left="0" w:firstLine="0"/>
+      </w:pPr>
+      <w:r>
+        <w:rPr>
+          <w:highlight w:val="yellow"/>
+        </w:rPr>
+        <w:t>Creating a @PostMapping controller</w:t>
+      </w:r>
+    </w:p>
+    <w:p>
+      <w:pPr>
+        <w:ind w:left="0" w:firstLine="0"/>
+      </w:pPr>
+    </w:p>
+    <w:p>
+      <w:pPr>
+        <w:ind w:left="0" w:firstLine="0"/>
+      </w:pPr>
+      <w:r>
+        <w:lastRenderedPageBreak/>
+        <w:drawing>
+          <wp:inline distT="0" distB="0" distL="0" distR="0" wp14:anchorId="55BBF0A6" wp14:editId="0F32A41B">
+            <wp:extent cx="5943600" cy="3876675"/>
+            <wp:effectExtent l="0" t="0" r="0" b="9525"/>
+            <wp:docPr id="488952491" name="Picture 1"/>
+            <wp:cNvGraphicFramePr>
+              <a:graphicFrameLocks xmlns:a="http://schemas.openxmlformats.org/drawingml/2006/main" noChangeAspect="1"/>
+            </wp:cNvGraphicFramePr>
+            <a:graphic xmlns:a="http://schemas.openxmlformats.org/drawingml/2006/main">
+              <a:graphicData uri="http://schemas.openxmlformats.org/drawingml/2006/picture">
+                <pic:pic xmlns:pic="http://schemas.openxmlformats.org/drawingml/2006/picture">
+                  <pic:nvPicPr>
+                    <pic:cNvPr id="488952491" name=""/>
+                    <pic:cNvPicPr/>
+                  </pic:nvPicPr>
+                  <pic:blipFill>
+                    <a:blip r:embed="rId39"/>
+                    <a:stretch>
+                      <a:fillRect/>
+                    </a:stretch>
+                  </pic:blipFill>
+                  <pic:spPr>
+                    <a:xfrm>
+                      <a:off x="0" y="0"/>
+                      <a:ext cx="5943600" cy="3876675"/>
+                    </a:xfrm>
+                    <a:prstGeom prst="rect">
+                      <a:avLst/>
+                    </a:prstGeom>
+                  </pic:spPr>
+                </pic:pic>
+              </a:graphicData>
+            </a:graphic>
+          </wp:inline>
+        </w:drawing>
+      </w:r>
+    </w:p>
+    <w:p>
+      <w:pPr>
+        <w:ind w:left="0" w:firstLine="0"/>
+      </w:pPr>
+      <w:r>
+        <w:rPr>
+          <w:highlight w:val="yellow"/>
+        </w:rPr>
+        <w:t>Enabling cross applications to communicate</w:t>
+      </w:r>
+    </w:p>
+    <w:p>
+      <w:pPr>
+        <w:ind w:left="0" w:firstLine="0"/>
+      </w:pPr>
+      <w:r>
+        <w:lastRenderedPageBreak/>
+        <w:drawing>
+          <wp:inline distT="0" distB="0" distL="0" distR="0" wp14:anchorId="127BF2A0" wp14:editId="26A9CCA2">
+            <wp:extent cx="5943600" cy="3790315"/>
+            <wp:effectExtent l="0" t="0" r="0" b="635"/>
+            <wp:docPr id="132307617" name="Picture 1"/>
+            <wp:cNvGraphicFramePr>
+              <a:graphicFrameLocks xmlns:a="http://schemas.openxmlformats.org/drawingml/2006/main" noChangeAspect="1"/>
+            </wp:cNvGraphicFramePr>
+            <a:graphic xmlns:a="http://schemas.openxmlformats.org/drawingml/2006/main">
+              <a:graphicData uri="http://schemas.openxmlformats.org/drawingml/2006/picture">
+                <pic:pic xmlns:pic="http://schemas.openxmlformats.org/drawingml/2006/picture">
+                  <pic:nvPicPr>
+                    <pic:cNvPr id="132307617" name=""/>
+                    <pic:cNvPicPr/>
+                  </pic:nvPicPr>
+                  <pic:blipFill>
+                    <a:blip r:embed="rId40"/>
+                    <a:stretch>
+                      <a:fillRect/>
+                    </a:stretch>
+                  </pic:blipFill>
+                  <pic:spPr>
+                    <a:xfrm>
+                      <a:off x="0" y="0"/>
+                      <a:ext cx="5943600" cy="3790315"/>
+                    </a:xfrm>
+                    <a:prstGeom prst="rect">
+                      <a:avLst/>
+                    </a:prstGeom>
+                  </pic:spPr>
+                </pic:pic>
+              </a:graphicData>
+            </a:graphic>
+          </wp:inline>
+        </w:drawing>
+      </w:r>
+    </w:p>
+    <w:p>
+      <w:pPr>
+        <w:ind w:left="0" w:firstLine="0"/>
+      </w:pPr>
+      <w:r>
+        <w:rPr>
+          <w:highlight w:val="yellow"/>
+        </w:rPr>
+        <w:t>Other features to implement</w:t>
+      </w:r>
+    </w:p>
+    <w:p>
+      <w:pPr>
+        <w:pStyle w:val="ListParagraph"/>
+        <w:numPr>
+          <w:ilvl w:val="0"/>
+          <w:numId w:val="11"/>
+        </w:numPr>
+      </w:pPr>
+      <w:r>
+        <w:t xml:space="preserve">searchContacts -&gt; this must search the contacts of a profile based on the name, that returns list of contacts starting </w:t>
+      </w:r>
+      <w:proofErr w:type="gramStart"/>
+      <w:r>
+        <w:t>with  some</w:t>
+      </w:r>
+      <w:proofErr w:type="gramEnd"/>
+      <w:r>
+        <w:t xml:space="preserve"> letters</w:t>
+      </w:r>
+    </w:p>
+    <w:p>
+      <w:pPr>
+        <w:pStyle w:val="ListParagraph"/>
+        <w:ind w:firstLine="0"/>
+      </w:pPr>
+      <w:r>
+        <w:t>ex: if you enter A, then you must get all the contacts starting with the name A, (don’t need to modify Repositor, you can implement this in the service layer itself)</w:t>
+      </w:r>
+    </w:p>
+    <w:p>
+      <w:pPr>
+        <w:pStyle w:val="ListParagraph"/>
+        <w:numPr>
+          <w:ilvl w:val="0"/>
+          <w:numId w:val="11"/>
+        </w:numPr>
+      </w:pPr>
+      <w:proofErr w:type="spellStart"/>
+      <w:r>
+        <w:t>deleteContact</w:t>
+      </w:r>
+      <w:proofErr w:type="spellEnd"/>
+      <w:r>
+        <w:t xml:space="preserve"> -&gt; delete the contact for a particular contact-id</w:t>
+      </w:r>
+    </w:p>
+    <w:p>
+      <w:pPr>
+        <w:pStyle w:val="ListParagraph"/>
+        <w:numPr>
+          <w:ilvl w:val="0"/>
+          <w:numId w:val="11"/>
+        </w:numPr>
+      </w:pPr>
+      <w:proofErr w:type="spellStart"/>
+      <w:r>
+        <w:t>updateContact</w:t>
+      </w:r>
+      <w:proofErr w:type="spellEnd"/>
+      <w:r>
+        <w:t xml:space="preserve"> -&gt; update the phone number based on the contact-id</w:t>
+      </w:r>
+    </w:p>
+    <w:p>
+      <w:pPr>
+        <w:ind w:left="0" w:firstLine="0"/>
+      </w:pPr>
+    </w:p>
+    <w:p>
+      <w:pPr>
+        <w:ind w:left="0" w:firstLine="0"/>
+      </w:pPr>
+      <w:r>
+        <w:rPr>
+          <w:highlight w:val="yellow"/>
+        </w:rPr>
+        <w:t>React.js</w:t>
+      </w:r>
+    </w:p>
+    <w:p>
+      <w:pPr>
+        <w:ind w:left="0" w:firstLine="0"/>
+      </w:pPr>
+      <w:r>
+        <w:t>It is used to develop Single Page Applications using JSX &amp; HTML</w:t>
+      </w:r>
+    </w:p>
+    <w:p>
+      <w:pPr>
+        <w:ind w:left="0" w:firstLine="0"/>
+      </w:pPr>
+      <w:r>
+        <w:t>JSX: It is a Javascript + XML technology that helps to write HTML easily in Javascript</w:t>
+      </w:r>
+    </w:p>
+    <w:p>
+      <w:pPr>
+        <w:ind w:left="0" w:firstLine="0"/>
+      </w:pPr>
+      <w:r>
+        <w:rPr>
+          <w:highlight w:val="yellow"/>
+        </w:rPr>
+        <w:t>In JSX</w:t>
+      </w:r>
+    </w:p>
+    <w:p>
+      <w:pPr>
+        <w:ind w:left="0" w:firstLine="0"/>
+      </w:pPr>
+      <w:r>
+        <w:t xml:space="preserve">let profile = &lt;h1&gt;Hello {user}&lt;/h1&gt;  </w:t>
+      </w:r>
+    </w:p>
+    <w:p>
+      <w:pPr>
+        <w:ind w:left="0" w:firstLine="0"/>
+      </w:pPr>
+      <w:r>
+        <w:rPr>
+          <w:highlight w:val="yellow"/>
+        </w:rPr>
+        <w:lastRenderedPageBreak/>
+        <w:t>In JS</w:t>
+      </w:r>
+    </w:p>
+    <w:p>
+      <w:pPr>
+        <w:ind w:left="0" w:firstLine="0"/>
+      </w:pPr>
+      <w:r>
+        <w:t>let profile = “&lt;h1&gt;</w:t>
+      </w:r>
+      <w:proofErr w:type="gramStart"/>
+      <w:r>
+        <w:t>Hello ”</w:t>
+      </w:r>
+      <w:proofErr w:type="gramEnd"/>
+      <w:r>
+        <w:t>+user</w:t>
+      </w:r>
+      <w:proofErr w:type="gramStart"/>
+      <w:r>
+        <w:t>+”&lt;</w:t>
+      </w:r>
+      <w:proofErr w:type="gramEnd"/>
+      <w:r>
+        <w:t>/h1&gt;”;</w:t>
+      </w:r>
+    </w:p>
+    <w:p>
+      <w:pPr>
+        <w:ind w:left="0" w:firstLine="0"/>
+      </w:pPr>
+      <w:r>
+        <w:t xml:space="preserve">React.js in fact converts JSX to JS, this JSX is to simplify writing HTML in Javascript, it supports all the Javascript feature </w:t>
+      </w:r>
+    </w:p>
+    <w:p>
+      <w:pPr>
+        <w:ind w:left="0" w:firstLine="0"/>
+      </w:pPr>
+      <w:r>
+        <w:rPr>
+          <w:highlight w:val="yellow"/>
+        </w:rPr>
+        <w:t>Software’s required for React.js</w:t>
+      </w:r>
+    </w:p>
+    <w:p>
+      <w:pPr>
+        <w:pStyle w:val="ListParagraph"/>
+        <w:numPr>
+          <w:ilvl w:val="0"/>
+          <w:numId w:val="12"/>
+        </w:numPr>
+      </w:pPr>
+      <w:r>
+        <w:t>Node.js</w:t>
+      </w:r>
+      <w:r>
+        <w:t xml:space="preserve"> - 2</w:t>
+      </w:r>
+      <w:r>
+        <w:t>2</w:t>
+      </w:r>
+      <w:r>
+        <w:t xml:space="preserve"> LTS</w:t>
+      </w:r>
+    </w:p>
+    <w:p>
+      <w:pPr>
+        <w:pStyle w:val="ListParagraph"/>
+        <w:numPr>
+          <w:ilvl w:val="0"/>
+          <w:numId w:val="12"/>
+        </w:numPr>
+      </w:pPr>
+      <w:r>
+        <w:t xml:space="preserve">VS Code </w:t>
+      </w:r>
+    </w:p>
+    <w:p>
+      <w:pPr>
+        <w:ind w:left="0" w:firstLine="0"/>
+      </w:pPr>
+      <w:r>
+        <w:drawing>
+          <wp:inline distT="0" distB="0" distL="0" distR="0" wp14:anchorId="3D1A8395" wp14:editId="3D36C472">
+            <wp:extent cx="4858428" cy="3277057"/>
+            <wp:effectExtent l="0" t="0" r="0" b="0"/>
+            <wp:docPr id="1305558115" name="Picture 1"/>
+            <wp:cNvGraphicFramePr>
+              <a:graphicFrameLocks xmlns:a="http://schemas.openxmlformats.org/drawingml/2006/main" noChangeAspect="1"/>
+            </wp:cNvGraphicFramePr>
+            <a:graphic xmlns:a="http://schemas.openxmlformats.org/drawingml/2006/main">
+              <a:graphicData uri="http://schemas.openxmlformats.org/drawingml/2006/picture">
+                <pic:pic xmlns:pic="http://schemas.openxmlformats.org/drawingml/2006/picture">
+                  <pic:nvPicPr>
+                    <pic:cNvPr id="1305558115" name=""/>
+                    <pic:cNvPicPr/>
+                  </pic:nvPicPr>
+                  <pic:blipFill>
+                    <a:blip r:embed="rId41"/>
+                    <a:stretch>
+                      <a:fillRect/>
+                    </a:stretch>
+                  </pic:blipFill>
+                  <pic:spPr>
+                    <a:xfrm>
+                      <a:off x="0" y="0"/>
+                      <a:ext cx="4858428" cy="3277057"/>
+                    </a:xfrm>
+                    <a:prstGeom prst="rect">
+                      <a:avLst/>
+                    </a:prstGeom>
+                  </pic:spPr>
+                </pic:pic>
+              </a:graphicData>
+            </a:graphic>
+          </wp:inline>
+        </w:drawing>
+      </w:r>
+    </w:p>
+    <w:p>
+      <w:pPr>
+        <w:ind w:left="0" w:firstLine="0"/>
+      </w:pPr>
+      <w:r>
+        <w:t>There are Javascript communities which provides us creating React applications in a simple way i.e., Vite</w:t>
+      </w:r>
+    </w:p>
+    <w:p>
+      <w:pPr>
+        <w:ind w:left="0" w:firstLine="0"/>
+      </w:pPr>
+      <w:r>
+        <w:rPr>
+          <w:highlight w:val="yellow"/>
+        </w:rPr>
+        <w:t>Create a react project using vite</w:t>
+      </w:r>
+    </w:p>
+    <w:p>
+      <w:pPr>
+        <w:ind w:left="0" w:firstLine="0"/>
+      </w:pPr>
+      <w:r>
+        <w:t>npm create vite@latest my-react-app</w:t>
+      </w:r>
+    </w:p>
+    <w:p>
+      <w:pPr>
+        <w:ind w:left="0" w:firstLine="0"/>
+      </w:pPr>
+      <w:r>
+        <w:t xml:space="preserve">It prompts </w:t>
+      </w:r>
+    </w:p>
+    <w:p>
+      <w:pPr>
+        <w:pStyle w:val="ListParagraph"/>
+        <w:numPr>
+          <w:ilvl w:val="0"/>
+          <w:numId w:val="14"/>
+        </w:numPr>
+      </w:pPr>
+      <w:r>
+        <w:t xml:space="preserve"> select framework -&gt; react</w:t>
+      </w:r>
+    </w:p>
+    <w:p>
+      <w:pPr>
+        <w:pStyle w:val="ListParagraph"/>
+        <w:numPr>
+          <w:ilvl w:val="0"/>
+          <w:numId w:val="14"/>
+        </w:numPr>
+      </w:pPr>
+      <w:r>
+        <w:t>select variant -&gt; Javascript</w:t>
+      </w:r>
+    </w:p>
+    <w:p>
+      <w:pPr>
+        <w:ind w:left="0" w:firstLine="0"/>
+      </w:pPr>
+      <w:r>
+        <w:lastRenderedPageBreak/>
+        <w:drawing>
+          <wp:inline distT="0" distB="0" distL="0" distR="0" wp14:anchorId="55B7E5A1" wp14:editId="5B64BC52">
+            <wp:extent cx="5943600" cy="2841625"/>
+            <wp:effectExtent l="0" t="0" r="0" b="0"/>
+            <wp:docPr id="832071719" name="Picture 1"/>
+            <wp:cNvGraphicFramePr>
+              <a:graphicFrameLocks xmlns:a="http://schemas.openxmlformats.org/drawingml/2006/main" noChangeAspect="1"/>
+            </wp:cNvGraphicFramePr>
+            <a:graphic xmlns:a="http://schemas.openxmlformats.org/drawingml/2006/main">
+              <a:graphicData uri="http://schemas.openxmlformats.org/drawingml/2006/picture">
+                <pic:pic xmlns:pic="http://schemas.openxmlformats.org/drawingml/2006/picture">
+                  <pic:nvPicPr>
+                    <pic:cNvPr id="832071719" name=""/>
+                    <pic:cNvPicPr/>
+                  </pic:nvPicPr>
+                  <pic:blipFill>
+                    <a:blip r:embed="rId42"/>
+                    <a:stretch>
+                      <a:fillRect/>
+                    </a:stretch>
+                  </pic:blipFill>
+                  <pic:spPr>
+                    <a:xfrm>
+                      <a:off x="0" y="0"/>
+                      <a:ext cx="5943600" cy="2841625"/>
+                    </a:xfrm>
+                    <a:prstGeom prst="rect">
+                      <a:avLst/>
+                    </a:prstGeom>
+                  </pic:spPr>
+                </pic:pic>
+              </a:graphicData>
+            </a:graphic>
+          </wp:inline>
+        </w:drawing>
+      </w:r>
+    </w:p>
+    <w:p>
+      <w:pPr>
+        <w:ind w:left="0" w:firstLine="0"/>
+      </w:pPr>
+      <w:r>
+        <w:t>You can stop the application using control + c and then you can use npm run dev to launch the application</w:t>
+      </w:r>
+    </w:p>
+    <w:p>
+      <w:pPr>
+        <w:ind w:left="0" w:firstLine="0"/>
+      </w:pPr>
+      <w:r>
+        <w:rPr>
+          <w:highlight w:val="yellow"/>
+        </w:rPr>
+        <w:t>Note:</w:t>
+      </w:r>
+      <w:r>
+        <w:t xml:space="preserve"> Make sure you are inside my-contact-</w:t>
+      </w:r>
+      <w:proofErr w:type="spellStart"/>
+      <w:r>
+        <w:t>ui</w:t>
+      </w:r>
+      <w:proofErr w:type="spellEnd"/>
+    </w:p>
+    <w:p>
+      <w:pPr>
+        <w:ind w:left="0" w:firstLine="0"/>
+      </w:pPr>
+      <w:r>
+        <w:drawing>
+          <wp:inline distT="0" distB="0" distL="0" distR="0" wp14:anchorId="38206F19" wp14:editId="46A1FB09">
+            <wp:extent cx="5943600" cy="1572895"/>
+            <wp:effectExtent l="0" t="0" r="0" b="8255"/>
+            <wp:docPr id="1100838532" name="Picture 1"/>
+            <wp:cNvGraphicFramePr>
+              <a:graphicFrameLocks xmlns:a="http://schemas.openxmlformats.org/drawingml/2006/main" noChangeAspect="1"/>
+            </wp:cNvGraphicFramePr>
+            <a:graphic xmlns:a="http://schemas.openxmlformats.org/drawingml/2006/main">
+              <a:graphicData uri="http://schemas.openxmlformats.org/drawingml/2006/picture">
+                <pic:pic xmlns:pic="http://schemas.openxmlformats.org/drawingml/2006/picture">
+                  <pic:nvPicPr>
+                    <pic:cNvPr id="1100838532" name=""/>
+                    <pic:cNvPicPr/>
+                  </pic:nvPicPr>
+                  <pic:blipFill>
+                    <a:blip r:embed="rId43"/>
+                    <a:stretch>
+                      <a:fillRect/>
+                    </a:stretch>
+                  </pic:blipFill>
+                  <pic:spPr>
+                    <a:xfrm>
+                      <a:off x="0" y="0"/>
+                      <a:ext cx="5943600" cy="1572895"/>
+                    </a:xfrm>
+                    <a:prstGeom prst="rect">
+                      <a:avLst/>
+                    </a:prstGeom>
+                  </pic:spPr>
+                </pic:pic>
+              </a:graphicData>
+            </a:graphic>
+          </wp:inline>
+        </w:drawing>
+      </w:r>
+    </w:p>
+    <w:p>
+      <w:pPr>
+        <w:ind w:left="0" w:firstLine="0"/>
+      </w:pPr>
+      <w:r>
+        <w:rPr>
+          <w:highlight w:val="yellow"/>
+        </w:rPr>
+        <w:t>React components:</w:t>
+      </w:r>
+      <w:r>
+        <w:t xml:space="preserve"> </w:t>
+      </w:r>
+    </w:p>
+    <w:p>
+      <w:pPr>
+        <w:ind w:left="0" w:firstLine="0"/>
+      </w:pPr>
+      <w:r>
+        <w:t>Components are reusable templates which you can display to the user</w:t>
+      </w:r>
+      <w:r>
+        <w:t xml:space="preserve">, this you can independently create and use wherever </w:t>
+      </w:r>
+      <w:r>
+        <w:t>required.</w:t>
+      </w:r>
+    </w:p>
+    <w:p>
+      <w:pPr>
+        <w:ind w:left="0" w:firstLine="0"/>
+      </w:pPr>
+      <w:r>
+        <w:t xml:space="preserve">function </w:t>
+      </w:r>
+      <w:proofErr w:type="gramStart"/>
+      <w:r>
+        <w:rPr>
+          <w:color w:val="EE0000"/>
+        </w:rPr>
+        <w:t>Profile</w:t>
+      </w:r>
+      <w:r>
+        <w:t>(</w:t>
+      </w:r>
+      <w:proofErr w:type="gramEnd"/>
+      <w:r>
+        <w:t xml:space="preserve">) { </w:t>
+      </w:r>
+      <w:r>
+        <w:br/>
+        <w:t xml:space="preserve">   let id = 12345;</w:t>
+      </w:r>
+      <w:r>
+        <w:br/>
+        <w:t xml:space="preserve">   let name = “Alex”;</w:t>
+      </w:r>
+      <w:r>
+        <w:br/>
+        <w:t xml:space="preserve">   return (&lt;div&gt;Name = {name}, Id = {id}&lt;/div&gt;)</w:t>
+      </w:r>
+      <w:r>
+        <w:br/>
+        <w:t>}</w:t>
+      </w:r>
+    </w:p>
+    <w:p>
+      <w:pPr>
+        <w:ind w:left="0" w:firstLine="0"/>
+      </w:pPr>
+      <w:r>
+        <w:rPr>
+          <w:highlight w:val="yellow"/>
+        </w:rPr>
+        <w:lastRenderedPageBreak/>
+        <w:t>Note:</w:t>
+      </w:r>
+      <w:r>
+        <w:t xml:space="preserve"> function name must begin with uppercase</w:t>
+      </w:r>
+    </w:p>
+    <w:p>
+      <w:pPr>
+        <w:ind w:left="0" w:firstLine="0"/>
+      </w:pPr>
+      <w:r>
+        <w:rPr>
+          <w:highlight w:val="yellow"/>
+        </w:rPr>
+        <w:t>How to use the component now in other components</w:t>
+      </w:r>
+    </w:p>
+    <w:p>
+      <w:pPr>
+        <w:ind w:left="0" w:firstLine="0"/>
+      </w:pPr>
+      <w:r>
+        <w:t>&lt;</w:t>
+      </w:r>
+      <w:r>
+        <w:rPr>
+          <w:color w:val="EE0000"/>
+        </w:rPr>
+        <w:t xml:space="preserve">Profile </w:t>
+      </w:r>
+      <w:r>
+        <w:t>/&gt;</w:t>
+      </w:r>
+    </w:p>
+    <w:p>
+      <w:pPr>
+        <w:ind w:left="0" w:firstLine="0"/>
+      </w:pPr>
+      <w:proofErr w:type="spellStart"/>
+      <w:r>
+        <w:rPr>
+          <w:highlight w:val="yellow"/>
+        </w:rPr>
+        <w:t>App.jsx</w:t>
+      </w:r>
+      <w:proofErr w:type="spellEnd"/>
+    </w:p>
+    <w:p>
+      <w:pPr>
+        <w:ind w:left="0" w:firstLine="0"/>
+      </w:pPr>
+      <w:r>
+        <w:drawing>
+          <wp:inline distT="0" distB="0" distL="0" distR="0" wp14:anchorId="6ED9B894" wp14:editId="0491385C">
+            <wp:extent cx="5943600" cy="2733675"/>
+            <wp:effectExtent l="0" t="0" r="0" b="9525"/>
+            <wp:docPr id="859113968" name="Picture 1"/>
+            <wp:cNvGraphicFramePr>
+              <a:graphicFrameLocks xmlns:a="http://schemas.openxmlformats.org/drawingml/2006/main" noChangeAspect="1"/>
+            </wp:cNvGraphicFramePr>
+            <a:graphic xmlns:a="http://schemas.openxmlformats.org/drawingml/2006/main">
+              <a:graphicData uri="http://schemas.openxmlformats.org/drawingml/2006/picture">
+                <pic:pic xmlns:pic="http://schemas.openxmlformats.org/drawingml/2006/picture">
+                  <pic:nvPicPr>
+                    <pic:cNvPr id="859113968" name=""/>
+                    <pic:cNvPicPr/>
+                  </pic:nvPicPr>
+                  <pic:blipFill>
+                    <a:blip r:embed="rId44"/>
+                    <a:stretch>
+                      <a:fillRect/>
+                    </a:stretch>
+                  </pic:blipFill>
+                  <pic:spPr>
+                    <a:xfrm>
+                      <a:off x="0" y="0"/>
+                      <a:ext cx="5943600" cy="2733675"/>
+                    </a:xfrm>
+                    <a:prstGeom prst="rect">
+                      <a:avLst/>
+                    </a:prstGeom>
+                  </pic:spPr>
+                </pic:pic>
+              </a:graphicData>
+            </a:graphic>
+          </wp:inline>
+        </w:drawing>
+      </w:r>
+    </w:p>
+    <w:p>
+      <w:pPr>
+        <w:ind w:left="0" w:firstLine="0"/>
+      </w:pPr>
+      <w:r>
+        <w:rPr>
+          <w:highlight w:val="yellow"/>
+        </w:rPr>
+        <w:t>Output:</w:t>
+      </w:r>
+    </w:p>
+    <w:p>
+      <w:pPr>
+        <w:ind w:left="0" w:firstLine="0"/>
+      </w:pPr>
+      <w:r>
+        <w:drawing>
+          <wp:inline distT="0" distB="0" distL="0" distR="0" wp14:anchorId="3CC2FDD8" wp14:editId="1F911193">
+            <wp:extent cx="4448796" cy="2000529"/>
+            <wp:effectExtent l="0" t="0" r="9525" b="0"/>
+            <wp:docPr id="1326490836" name="Picture 1"/>
+            <wp:cNvGraphicFramePr>
+              <a:graphicFrameLocks xmlns:a="http://schemas.openxmlformats.org/drawingml/2006/main" noChangeAspect="1"/>
+            </wp:cNvGraphicFramePr>
+            <a:graphic xmlns:a="http://schemas.openxmlformats.org/drawingml/2006/main">
+              <a:graphicData uri="http://schemas.openxmlformats.org/drawingml/2006/picture">
+                <pic:pic xmlns:pic="http://schemas.openxmlformats.org/drawingml/2006/picture">
+                  <pic:nvPicPr>
+                    <pic:cNvPr id="1326490836" name=""/>
+                    <pic:cNvPicPr/>
+                  </pic:nvPicPr>
+                  <pic:blipFill>
+                    <a:blip r:embed="rId45"/>
+                    <a:stretch>
+                      <a:fillRect/>
+                    </a:stretch>
+                  </pic:blipFill>
+                  <pic:spPr>
+                    <a:xfrm>
+                      <a:off x="0" y="0"/>
+                      <a:ext cx="4448796" cy="2000529"/>
+                    </a:xfrm>
+                    <a:prstGeom prst="rect">
+                      <a:avLst/>
+                    </a:prstGeom>
+                  </pic:spPr>
+                </pic:pic>
+              </a:graphicData>
+            </a:graphic>
+          </wp:inline>
+        </w:drawing>
+      </w:r>
+    </w:p>
+    <w:p>
+      <w:pPr>
+        <w:ind w:left="0" w:firstLine="0"/>
+      </w:pPr>
+      <w:r>
+        <w:rPr>
+          <w:highlight w:val="yellow"/>
+        </w:rPr>
+        <w:t>Creating our own components</w:t>
+      </w:r>
+    </w:p>
+    <w:p>
+      <w:pPr>
+        <w:ind w:left="0" w:firstLine="0"/>
+      </w:pPr>
+      <w:r>
+        <w:rPr>
+          <w:highlight w:val="yellow"/>
+        </w:rPr>
+        <w:t>Profile.jsx</w:t>
+      </w:r>
+    </w:p>
+    <w:p>
+      <w:pPr>
+        <w:ind w:left="0" w:firstLine="0"/>
+      </w:pPr>
+      <w:r>
+        <w:lastRenderedPageBreak/>
+        <w:drawing>
+          <wp:inline distT="0" distB="0" distL="0" distR="0" wp14:anchorId="55E93E7B" wp14:editId="5924B95C">
+            <wp:extent cx="5943600" cy="2145665"/>
+            <wp:effectExtent l="0" t="0" r="0" b="6985"/>
+            <wp:docPr id="1848251701" name="Picture 1"/>
+            <wp:cNvGraphicFramePr>
+              <a:graphicFrameLocks xmlns:a="http://schemas.openxmlformats.org/drawingml/2006/main" noChangeAspect="1"/>
+            </wp:cNvGraphicFramePr>
+            <a:graphic xmlns:a="http://schemas.openxmlformats.org/drawingml/2006/main">
+              <a:graphicData uri="http://schemas.openxmlformats.org/drawingml/2006/picture">
+                <pic:pic xmlns:pic="http://schemas.openxmlformats.org/drawingml/2006/picture">
+                  <pic:nvPicPr>
+                    <pic:cNvPr id="1848251701" name=""/>
+                    <pic:cNvPicPr/>
+                  </pic:nvPicPr>
+                  <pic:blipFill>
+                    <a:blip r:embed="rId46"/>
+                    <a:stretch>
+                      <a:fillRect/>
+                    </a:stretch>
+                  </pic:blipFill>
+                  <pic:spPr>
+                    <a:xfrm>
+                      <a:off x="0" y="0"/>
+                      <a:ext cx="5943600" cy="2145665"/>
+                    </a:xfrm>
+                    <a:prstGeom prst="rect">
+                      <a:avLst/>
+                    </a:prstGeom>
+                  </pic:spPr>
+                </pic:pic>
+              </a:graphicData>
+            </a:graphic>
+          </wp:inline>
+        </w:drawing>
+      </w:r>
+    </w:p>
+    <w:p>
+      <w:pPr>
+        <w:ind w:left="0" w:firstLine="0"/>
+      </w:pPr>
+      <w:r>
+        <w:rPr>
+          <w:highlight w:val="yellow"/>
+        </w:rPr>
+        <w:t xml:space="preserve">Add this inside </w:t>
+      </w:r>
+      <w:proofErr w:type="spellStart"/>
+      <w:r>
+        <w:rPr>
+          <w:highlight w:val="yellow"/>
+        </w:rPr>
+        <w:t>App.jsx</w:t>
+      </w:r>
+      <w:proofErr w:type="spellEnd"/>
+    </w:p>
+    <w:p>
+      <w:pPr>
+        <w:ind w:left="0" w:firstLine="0"/>
+      </w:pPr>
+      <w:r>
+        <w:drawing>
+          <wp:inline distT="0" distB="0" distL="0" distR="0" wp14:anchorId="0130235B" wp14:editId="50671EAC">
+            <wp:extent cx="5943600" cy="4047490"/>
+            <wp:effectExtent l="0" t="0" r="0" b="0"/>
+            <wp:docPr id="729528060" name="Picture 1"/>
+            <wp:cNvGraphicFramePr>
+              <a:graphicFrameLocks xmlns:a="http://schemas.openxmlformats.org/drawingml/2006/main" noChangeAspect="1"/>
+            </wp:cNvGraphicFramePr>
+            <a:graphic xmlns:a="http://schemas.openxmlformats.org/drawingml/2006/main">
+              <a:graphicData uri="http://schemas.openxmlformats.org/drawingml/2006/picture">
+                <pic:pic xmlns:pic="http://schemas.openxmlformats.org/drawingml/2006/picture">
+                  <pic:nvPicPr>
+                    <pic:cNvPr id="729528060" name=""/>
+                    <pic:cNvPicPr/>
+                  </pic:nvPicPr>
+                  <pic:blipFill>
+                    <a:blip r:embed="rId47"/>
+                    <a:stretch>
+                      <a:fillRect/>
+                    </a:stretch>
+                  </pic:blipFill>
+                  <pic:spPr>
+                    <a:xfrm>
+                      <a:off x="0" y="0"/>
+                      <a:ext cx="5943600" cy="4047490"/>
+                    </a:xfrm>
+                    <a:prstGeom prst="rect">
+                      <a:avLst/>
+                    </a:prstGeom>
+                  </pic:spPr>
+                </pic:pic>
+              </a:graphicData>
+            </a:graphic>
+          </wp:inline>
+        </w:drawing>
+      </w:r>
+    </w:p>
+    <w:p>
+      <w:pPr>
+        <w:ind w:left="0" w:firstLine="0"/>
+      </w:pPr>
+      <w:r>
+        <w:rPr>
+          <w:highlight w:val="yellow"/>
+        </w:rPr>
+        <w:t>Output:</w:t>
+      </w:r>
+    </w:p>
+    <w:p>
+      <w:pPr>
+        <w:ind w:left="0" w:firstLine="0"/>
+      </w:pPr>
+      <w:r>
+        <w:lastRenderedPageBreak/>
+        <w:drawing>
+          <wp:inline distT="0" distB="0" distL="0" distR="0" wp14:anchorId="2D727AC1" wp14:editId="6F48EF7C">
+            <wp:extent cx="5943600" cy="3324225"/>
+            <wp:effectExtent l="0" t="0" r="0" b="9525"/>
+            <wp:docPr id="124785268" name="Picture 1"/>
+            <wp:cNvGraphicFramePr>
+              <a:graphicFrameLocks xmlns:a="http://schemas.openxmlformats.org/drawingml/2006/main" noChangeAspect="1"/>
+            </wp:cNvGraphicFramePr>
+            <a:graphic xmlns:a="http://schemas.openxmlformats.org/drawingml/2006/main">
+              <a:graphicData uri="http://schemas.openxmlformats.org/drawingml/2006/picture">
+                <pic:pic xmlns:pic="http://schemas.openxmlformats.org/drawingml/2006/picture">
+                  <pic:nvPicPr>
+                    <pic:cNvPr id="124785268" name=""/>
+                    <pic:cNvPicPr/>
+                  </pic:nvPicPr>
+                  <pic:blipFill>
+                    <a:blip r:embed="rId48"/>
+                    <a:stretch>
+                      <a:fillRect/>
+                    </a:stretch>
+                  </pic:blipFill>
+                  <pic:spPr>
+                    <a:xfrm>
+                      <a:off x="0" y="0"/>
+                      <a:ext cx="5943600" cy="3324225"/>
+                    </a:xfrm>
+                    <a:prstGeom prst="rect">
+                      <a:avLst/>
+                    </a:prstGeom>
+                  </pic:spPr>
+                </pic:pic>
+              </a:graphicData>
+            </a:graphic>
+          </wp:inline>
+        </w:drawing>
+      </w:r>
+    </w:p>
+    <w:p>
+      <w:pPr>
+        <w:ind w:left="0" w:firstLine="0"/>
+      </w:pPr>
     </w:p>
     <w:sectPr>
       <w:pgSz w:w="12240" w:h="15840"/>
@@ -2799,6 +4450,119 @@
 <file path=word/numbering.xml><?xml version="1.0" encoding="utf-8"?>
 <w:numbering xmlns:wpc="http://schemas.microsoft.com/office/word/2010/wordprocessingCanvas" xmlns:cx="http://schemas.microsoft.com/office/drawing/2014/chartex" xmlns:cx1="http://schemas.microsoft.com/office/drawing/2015/9/8/chartex" xmlns:cx2="http://schemas.microsoft.com/office/drawing/2015/10/21/chartex" xmlns:cx3="http://schemas.microsoft.com/office/drawing/2016/5/9/chartex" xmlns:cx4="http://schemas.microsoft.com/office/drawing/2016/5/10/chartex" xmlns:cx5="http://schemas.microsoft.com/office/drawing/2016/5/11/chartex" xmlns:cx6="http://schemas.microsoft.com/office/drawing/2016/5/12/chartex" xmlns:cx7="http://schemas.microsoft.com/office/drawing/2016/5/13/chartex" xmlns:cx8="http://schemas.microsoft.com/office/drawing/2016/5/14/chartex" xmlns:mc="http://schemas.openxmlformats.org/markup-compatibility/2006" xmlns:aink="http://schemas.microsoft.com/office/drawing/2016/ink" xmlns:am3d="http://schemas.microsoft.com/office/drawing/2017/model3d" xmlns:o="urn:schemas-microsoft-com:office:office" xmlns:oel="http://schemas.microsoft.com/office/2019/extlst" xmlns:r="http://schemas.openxmlformats.org/officeDocument/2006/relationships" xmlns:m="http://schemas.openxmlformats.org/officeDocument/2006/math" xmlns:v="urn:schemas-microsoft-com:vml" xmlns:wp14="http://schemas.microsoft.com/office/word/2010/wordprocessingDrawing" xmlns:wp="http://schemas.openxmlformats.org/drawingml/2006/wordprocessingDrawing" xmlns:w10="urn:schemas-microsoft-com:office:word" xmlns:w="http://schemas.openxmlformats.org/wordprocessingml/2006/main" xmlns:w14="http://schemas.microsoft.com/office/word/2010/wordml" xmlns:w15="http://schemas.microsoft.com/office/word/2012/wordml" xmlns:w16cex="http://schemas.microsoft.com/office/word/2018/wordml/cex" xmlns:w16cid="http://schemas.microsoft.com/office/word/2016/wordml/cid" xmlns:w16="http://schemas.microsoft.com/office/word/2018/wordml" xmlns:w16du="http://schemas.microsoft.com/office/word/2023/wordml/word16du" xmlns:w16sdtdh="http://schemas.microsoft.com/office/word/2020/wordml/sdtdatahash" xmlns:w16sdtfl="http://schemas.microsoft.com/office/word/2024/wordml/sdtformatlock" xmlns:w16se="http://schemas.microsoft.com/office/word/2015/wordml/symex" xmlns:wpg="http://schemas.microsoft.com/office/word/2010/wordprocessingGroup" xmlns:wpi="http://schemas.microsoft.com/office/word/2010/wordprocessingInk" xmlns:wne="http://schemas.microsoft.com/office/word/2006/wordml" xmlns:wps="http://schemas.microsoft.com/office/word/2010/wordprocessingShape" mc:Ignorable="w14 w15 w16se w16cid w16 w16cex w16sdtdh w16sdtfl w16du wp14">
   <w:abstractNum w:abstractNumId="0" w15:restartNumberingAfterBreak="0">
+    <w:nsid w:val="03225AB8"/>
+    <w:multiLevelType w:val="hybridMultilevel"/>
+    <w:tmpl w:val="2772A0B6"/>
+    <w:lvl w:ilvl="0" w:tplc="046E390E">
+      <w:start w:val="1"/>
+      <w:numFmt w:val="bullet"/>
+      <w:lvlText w:val=""/>
+      <w:lvlJc w:val="left"/>
+      <w:pPr>
+        <w:ind w:left="1080" w:hanging="360"/>
+      </w:pPr>
+      <w:rPr>
+        <w:rFonts w:ascii="Wingdings" w:eastAsiaTheme="minorHAnsi" w:hAnsi="Wingdings" w:cstheme="minorBidi" w:hint="default"/>
+      </w:rPr>
+    </w:lvl>
+    <w:lvl w:ilvl="1" w:tplc="04090003" w:tentative="1">
+      <w:start w:val="1"/>
+      <w:numFmt w:val="bullet"/>
+      <w:lvlText w:val="o"/>
+      <w:lvlJc w:val="left"/>
+      <w:pPr>
+        <w:ind w:left="1800" w:hanging="360"/>
+      </w:pPr>
+      <w:rPr>
+        <w:rFonts w:ascii="Courier New" w:hAnsi="Courier New" w:cs="Courier New" w:hint="default"/>
+      </w:rPr>
+    </w:lvl>
+    <w:lvl w:ilvl="2" w:tplc="04090005" w:tentative="1">
+      <w:start w:val="1"/>
+      <w:numFmt w:val="bullet"/>
+      <w:lvlText w:val=""/>
+      <w:lvlJc w:val="left"/>
+      <w:pPr>
+        <w:ind w:left="2520" w:hanging="360"/>
+      </w:pPr>
+      <w:rPr>
+        <w:rFonts w:ascii="Wingdings" w:hAnsi="Wingdings" w:hint="default"/>
+      </w:rPr>
+    </w:lvl>
+    <w:lvl w:ilvl="3" w:tplc="04090001" w:tentative="1">
+      <w:start w:val="1"/>
+      <w:numFmt w:val="bullet"/>
+      <w:lvlText w:val=""/>
+      <w:lvlJc w:val="left"/>
+      <w:pPr>
+        <w:ind w:left="3240" w:hanging="360"/>
+      </w:pPr>
+      <w:rPr>
+        <w:rFonts w:ascii="Symbol" w:hAnsi="Symbol" w:hint="default"/>
+      </w:rPr>
+    </w:lvl>
+    <w:lvl w:ilvl="4" w:tplc="04090003" w:tentative="1">
+      <w:start w:val="1"/>
+      <w:numFmt w:val="bullet"/>
+      <w:lvlText w:val="o"/>
+      <w:lvlJc w:val="left"/>
+      <w:pPr>
+        <w:ind w:left="3960" w:hanging="360"/>
+      </w:pPr>
+      <w:rPr>
+        <w:rFonts w:ascii="Courier New" w:hAnsi="Courier New" w:cs="Courier New" w:hint="default"/>
+      </w:rPr>
+    </w:lvl>
+    <w:lvl w:ilvl="5" w:tplc="04090005" w:tentative="1">
+      <w:start w:val="1"/>
+      <w:numFmt w:val="bullet"/>
+      <w:lvlText w:val=""/>
+      <w:lvlJc w:val="left"/>
+      <w:pPr>
+        <w:ind w:left="4680" w:hanging="360"/>
+      </w:pPr>
+      <w:rPr>
+        <w:rFonts w:ascii="Wingdings" w:hAnsi="Wingdings" w:hint="default"/>
+      </w:rPr>
+    </w:lvl>
+    <w:lvl w:ilvl="6" w:tplc="04090001" w:tentative="1">
+      <w:start w:val="1"/>
+      <w:numFmt w:val="bullet"/>
+      <w:lvlText w:val=""/>
+      <w:lvlJc w:val="left"/>
+      <w:pPr>
+        <w:ind w:left="5400" w:hanging="360"/>
+      </w:pPr>
+      <w:rPr>
+        <w:rFonts w:ascii="Symbol" w:hAnsi="Symbol" w:hint="default"/>
+      </w:rPr>
+    </w:lvl>
+    <w:lvl w:ilvl="7" w:tplc="04090003" w:tentative="1">
+      <w:start w:val="1"/>
+      <w:numFmt w:val="bullet"/>
+      <w:lvlText w:val="o"/>
+      <w:lvlJc w:val="left"/>
+      <w:pPr>
+        <w:ind w:left="6120" w:hanging="360"/>
+      </w:pPr>
+      <w:rPr>
+        <w:rFonts w:ascii="Courier New" w:hAnsi="Courier New" w:cs="Courier New" w:hint="default"/>
+      </w:rPr>
+    </w:lvl>
+    <w:lvl w:ilvl="8" w:tplc="04090005" w:tentative="1">
+      <w:start w:val="1"/>
+      <w:numFmt w:val="bullet"/>
+      <w:lvlText w:val=""/>
+      <w:lvlJc w:val="left"/>
+      <w:pPr>
+        <w:ind w:left="6840" w:hanging="360"/>
+      </w:pPr>
+      <w:rPr>
+        <w:rFonts w:ascii="Wingdings" w:hAnsi="Wingdings" w:hint="default"/>
+      </w:rPr>
+    </w:lvl>
+  </w:abstractNum>
+  <w:abstractNum w:abstractNumId="1" w15:restartNumberingAfterBreak="0">
     <w:nsid w:val="053F6AA0"/>
     <w:multiLevelType w:val="hybridMultilevel"/>
     <w:tmpl w:val="E626F376"/>
@@ -2887,7 +4651,120 @@
       </w:pPr>
     </w:lvl>
   </w:abstractNum>
-  <w:abstractNum w:abstractNumId="1" w15:restartNumberingAfterBreak="0">
+  <w:abstractNum w:abstractNumId="2" w15:restartNumberingAfterBreak="0">
+    <w:nsid w:val="07A210EB"/>
+    <w:multiLevelType w:val="hybridMultilevel"/>
+    <w:tmpl w:val="33C8CF18"/>
+    <w:lvl w:ilvl="0" w:tplc="F73C699E">
+      <w:start w:val="1"/>
+      <w:numFmt w:val="bullet"/>
+      <w:lvlText w:val=""/>
+      <w:lvlJc w:val="left"/>
+      <w:pPr>
+        <w:ind w:left="1440" w:hanging="360"/>
+      </w:pPr>
+      <w:rPr>
+        <w:rFonts w:ascii="Wingdings" w:eastAsiaTheme="minorHAnsi" w:hAnsi="Wingdings" w:cstheme="minorBidi" w:hint="default"/>
+      </w:rPr>
+    </w:lvl>
+    <w:lvl w:ilvl="1" w:tplc="04090003" w:tentative="1">
+      <w:start w:val="1"/>
+      <w:numFmt w:val="bullet"/>
+      <w:lvlText w:val="o"/>
+      <w:lvlJc w:val="left"/>
+      <w:pPr>
+        <w:ind w:left="2160" w:hanging="360"/>
+      </w:pPr>
+      <w:rPr>
+        <w:rFonts w:ascii="Courier New" w:hAnsi="Courier New" w:cs="Courier New" w:hint="default"/>
+      </w:rPr>
+    </w:lvl>
+    <w:lvl w:ilvl="2" w:tplc="04090005" w:tentative="1">
+      <w:start w:val="1"/>
+      <w:numFmt w:val="bullet"/>
+      <w:lvlText w:val=""/>
+      <w:lvlJc w:val="left"/>
+      <w:pPr>
+        <w:ind w:left="2880" w:hanging="360"/>
+      </w:pPr>
+      <w:rPr>
+        <w:rFonts w:ascii="Wingdings" w:hAnsi="Wingdings" w:hint="default"/>
+      </w:rPr>
+    </w:lvl>
+    <w:lvl w:ilvl="3" w:tplc="04090001" w:tentative="1">
+      <w:start w:val="1"/>
+      <w:numFmt w:val="bullet"/>
+      <w:lvlText w:val=""/>
+      <w:lvlJc w:val="left"/>
+      <w:pPr>
+        <w:ind w:left="3600" w:hanging="360"/>
+      </w:pPr>
+      <w:rPr>
+        <w:rFonts w:ascii="Symbol" w:hAnsi="Symbol" w:hint="default"/>
+      </w:rPr>
+    </w:lvl>
+    <w:lvl w:ilvl="4" w:tplc="04090003" w:tentative="1">
+      <w:start w:val="1"/>
+      <w:numFmt w:val="bullet"/>
+      <w:lvlText w:val="o"/>
+      <w:lvlJc w:val="left"/>
+      <w:pPr>
+        <w:ind w:left="4320" w:hanging="360"/>
+      </w:pPr>
+      <w:rPr>
+        <w:rFonts w:ascii="Courier New" w:hAnsi="Courier New" w:cs="Courier New" w:hint="default"/>
+      </w:rPr>
+    </w:lvl>
+    <w:lvl w:ilvl="5" w:tplc="04090005" w:tentative="1">
+      <w:start w:val="1"/>
+      <w:numFmt w:val="bullet"/>
+      <w:lvlText w:val=""/>
+      <w:lvlJc w:val="left"/>
+      <w:pPr>
+        <w:ind w:left="5040" w:hanging="360"/>
+      </w:pPr>
+      <w:rPr>
+        <w:rFonts w:ascii="Wingdings" w:hAnsi="Wingdings" w:hint="default"/>
+      </w:rPr>
+    </w:lvl>
+    <w:lvl w:ilvl="6" w:tplc="04090001" w:tentative="1">
+      <w:start w:val="1"/>
+      <w:numFmt w:val="bullet"/>
+      <w:lvlText w:val=""/>
+      <w:lvlJc w:val="left"/>
+      <w:pPr>
+        <w:ind w:left="5760" w:hanging="360"/>
+      </w:pPr>
+      <w:rPr>
+        <w:rFonts w:ascii="Symbol" w:hAnsi="Symbol" w:hint="default"/>
+      </w:rPr>
+    </w:lvl>
+    <w:lvl w:ilvl="7" w:tplc="04090003" w:tentative="1">
+      <w:start w:val="1"/>
+      <w:numFmt w:val="bullet"/>
+      <w:lvlText w:val="o"/>
+      <w:lvlJc w:val="left"/>
+      <w:pPr>
+        <w:ind w:left="6480" w:hanging="360"/>
+      </w:pPr>
+      <w:rPr>
+        <w:rFonts w:ascii="Courier New" w:hAnsi="Courier New" w:cs="Courier New" w:hint="default"/>
+      </w:rPr>
+    </w:lvl>
+    <w:lvl w:ilvl="8" w:tplc="04090005" w:tentative="1">
+      <w:start w:val="1"/>
+      <w:numFmt w:val="bullet"/>
+      <w:lvlText w:val=""/>
+      <w:lvlJc w:val="left"/>
+      <w:pPr>
+        <w:ind w:left="7200" w:hanging="360"/>
+      </w:pPr>
+      <w:rPr>
+        <w:rFonts w:ascii="Wingdings" w:hAnsi="Wingdings" w:hint="default"/>
+      </w:rPr>
+    </w:lvl>
+  </w:abstractNum>
+  <w:abstractNum w:abstractNumId="3" w15:restartNumberingAfterBreak="0">
     <w:nsid w:val="21E870B4"/>
     <w:multiLevelType w:val="hybridMultilevel"/>
     <w:tmpl w:val="DA209E1A"/>
@@ -2976,7 +4853,7 @@
       </w:pPr>
     </w:lvl>
   </w:abstractNum>
-  <w:abstractNum w:abstractNumId="2" w15:restartNumberingAfterBreak="0">
+  <w:abstractNum w:abstractNumId="4" w15:restartNumberingAfterBreak="0">
     <w:nsid w:val="26AF477A"/>
     <w:multiLevelType w:val="hybridMultilevel"/>
     <w:tmpl w:val="F2821D72"/>
@@ -3065,7 +4942,120 @@
       </w:pPr>
     </w:lvl>
   </w:abstractNum>
-  <w:abstractNum w:abstractNumId="3" w15:restartNumberingAfterBreak="0">
+  <w:abstractNum w:abstractNumId="5" w15:restartNumberingAfterBreak="0">
+    <w:nsid w:val="2FC25DD0"/>
+    <w:multiLevelType w:val="hybridMultilevel"/>
+    <w:tmpl w:val="F2429540"/>
+    <w:lvl w:ilvl="0" w:tplc="447EFCC0">
+      <w:start w:val="1"/>
+      <w:numFmt w:val="bullet"/>
+      <w:lvlText w:val=""/>
+      <w:lvlJc w:val="left"/>
+      <w:pPr>
+        <w:ind w:left="1080" w:hanging="360"/>
+      </w:pPr>
+      <w:rPr>
+        <w:rFonts w:ascii="Wingdings" w:eastAsiaTheme="minorHAnsi" w:hAnsi="Wingdings" w:cstheme="minorBidi" w:hint="default"/>
+      </w:rPr>
+    </w:lvl>
+    <w:lvl w:ilvl="1" w:tplc="04090003" w:tentative="1">
+      <w:start w:val="1"/>
+      <w:numFmt w:val="bullet"/>
+      <w:lvlText w:val="o"/>
+      <w:lvlJc w:val="left"/>
+      <w:pPr>
+        <w:ind w:left="1800" w:hanging="360"/>
+      </w:pPr>
+      <w:rPr>
+        <w:rFonts w:ascii="Courier New" w:hAnsi="Courier New" w:cs="Courier New" w:hint="default"/>
+      </w:rPr>
+    </w:lvl>
+    <w:lvl w:ilvl="2" w:tplc="04090005" w:tentative="1">
+      <w:start w:val="1"/>
+      <w:numFmt w:val="bullet"/>
+      <w:lvlText w:val=""/>
+      <w:lvlJc w:val="left"/>
+      <w:pPr>
+        <w:ind w:left="2520" w:hanging="360"/>
+      </w:pPr>
+      <w:rPr>
+        <w:rFonts w:ascii="Wingdings" w:hAnsi="Wingdings" w:hint="default"/>
+      </w:rPr>
+    </w:lvl>
+    <w:lvl w:ilvl="3" w:tplc="04090001" w:tentative="1">
+      <w:start w:val="1"/>
+      <w:numFmt w:val="bullet"/>
+      <w:lvlText w:val=""/>
+      <w:lvlJc w:val="left"/>
+      <w:pPr>
+        <w:ind w:left="3240" w:hanging="360"/>
+      </w:pPr>
+      <w:rPr>
+        <w:rFonts w:ascii="Symbol" w:hAnsi="Symbol" w:hint="default"/>
+      </w:rPr>
+    </w:lvl>
+    <w:lvl w:ilvl="4" w:tplc="04090003" w:tentative="1">
+      <w:start w:val="1"/>
+      <w:numFmt w:val="bullet"/>
+      <w:lvlText w:val="o"/>
+      <w:lvlJc w:val="left"/>
+      <w:pPr>
+        <w:ind w:left="3960" w:hanging="360"/>
+      </w:pPr>
+      <w:rPr>
+        <w:rFonts w:ascii="Courier New" w:hAnsi="Courier New" w:cs="Courier New" w:hint="default"/>
+      </w:rPr>
+    </w:lvl>
+    <w:lvl w:ilvl="5" w:tplc="04090005" w:tentative="1">
+      <w:start w:val="1"/>
+      <w:numFmt w:val="bullet"/>
+      <w:lvlText w:val=""/>
+      <w:lvlJc w:val="left"/>
+      <w:pPr>
+        <w:ind w:left="4680" w:hanging="360"/>
+      </w:pPr>
+      <w:rPr>
+        <w:rFonts w:ascii="Wingdings" w:hAnsi="Wingdings" w:hint="default"/>
+      </w:rPr>
+    </w:lvl>
+    <w:lvl w:ilvl="6" w:tplc="04090001" w:tentative="1">
+      <w:start w:val="1"/>
+      <w:numFmt w:val="bullet"/>
+      <w:lvlText w:val=""/>
+      <w:lvlJc w:val="left"/>
+      <w:pPr>
+        <w:ind w:left="5400" w:hanging="360"/>
+      </w:pPr>
+      <w:rPr>
+        <w:rFonts w:ascii="Symbol" w:hAnsi="Symbol" w:hint="default"/>
+      </w:rPr>
+    </w:lvl>
+    <w:lvl w:ilvl="7" w:tplc="04090003" w:tentative="1">
+      <w:start w:val="1"/>
+      <w:numFmt w:val="bullet"/>
+      <w:lvlText w:val="o"/>
+      <w:lvlJc w:val="left"/>
+      <w:pPr>
+        <w:ind w:left="6120" w:hanging="360"/>
+      </w:pPr>
+      <w:rPr>
+        <w:rFonts w:ascii="Courier New" w:hAnsi="Courier New" w:cs="Courier New" w:hint="default"/>
+      </w:rPr>
+    </w:lvl>
+    <w:lvl w:ilvl="8" w:tplc="04090005" w:tentative="1">
+      <w:start w:val="1"/>
+      <w:numFmt w:val="bullet"/>
+      <w:lvlText w:val=""/>
+      <w:lvlJc w:val="left"/>
+      <w:pPr>
+        <w:ind w:left="6840" w:hanging="360"/>
+      </w:pPr>
+      <w:rPr>
+        <w:rFonts w:ascii="Wingdings" w:hAnsi="Wingdings" w:hint="default"/>
+      </w:rPr>
+    </w:lvl>
+  </w:abstractNum>
+  <w:abstractNum w:abstractNumId="6" w15:restartNumberingAfterBreak="0">
     <w:nsid w:val="300B546D"/>
     <w:multiLevelType w:val="hybridMultilevel"/>
     <w:tmpl w:val="171281B2"/>
@@ -3154,7 +5144,7 @@
       </w:pPr>
     </w:lvl>
   </w:abstractNum>
-  <w:abstractNum w:abstractNumId="4" w15:restartNumberingAfterBreak="0">
+  <w:abstractNum w:abstractNumId="7" w15:restartNumberingAfterBreak="0">
     <w:nsid w:val="41326903"/>
     <w:multiLevelType w:val="hybridMultilevel"/>
     <w:tmpl w:val="44B89B9C"/>
@@ -3243,7 +5233,96 @@
       </w:pPr>
     </w:lvl>
   </w:abstractNum>
-  <w:abstractNum w:abstractNumId="5" w15:restartNumberingAfterBreak="0">
+  <w:abstractNum w:abstractNumId="8" w15:restartNumberingAfterBreak="0">
+    <w:nsid w:val="4B247A4C"/>
+    <w:multiLevelType w:val="hybridMultilevel"/>
+    <w:tmpl w:val="2A3A7B54"/>
+    <w:lvl w:ilvl="0" w:tplc="FFFFFFFF">
+      <w:start w:val="1"/>
+      <w:numFmt w:val="decimal"/>
+      <w:lvlText w:val="%1."/>
+      <w:lvlJc w:val="left"/>
+      <w:pPr>
+        <w:ind w:left="720" w:hanging="360"/>
+      </w:pPr>
+      <w:rPr>
+        <w:rFonts w:hint="default"/>
+      </w:rPr>
+    </w:lvl>
+    <w:lvl w:ilvl="1" w:tplc="FFFFFFFF" w:tentative="1">
+      <w:start w:val="1"/>
+      <w:numFmt w:val="lowerLetter"/>
+      <w:lvlText w:val="%2."/>
+      <w:lvlJc w:val="left"/>
+      <w:pPr>
+        <w:ind w:left="1440" w:hanging="360"/>
+      </w:pPr>
+    </w:lvl>
+    <w:lvl w:ilvl="2" w:tplc="FFFFFFFF" w:tentative="1">
+      <w:start w:val="1"/>
+      <w:numFmt w:val="lowerRoman"/>
+      <w:lvlText w:val="%3."/>
+      <w:lvlJc w:val="right"/>
+      <w:pPr>
+        <w:ind w:left="2160" w:hanging="180"/>
+      </w:pPr>
+    </w:lvl>
+    <w:lvl w:ilvl="3" w:tplc="FFFFFFFF" w:tentative="1">
+      <w:start w:val="1"/>
+      <w:numFmt w:val="decimal"/>
+      <w:lvlText w:val="%4."/>
+      <w:lvlJc w:val="left"/>
+      <w:pPr>
+        <w:ind w:left="2880" w:hanging="360"/>
+      </w:pPr>
+    </w:lvl>
+    <w:lvl w:ilvl="4" w:tplc="FFFFFFFF" w:tentative="1">
+      <w:start w:val="1"/>
+      <w:numFmt w:val="lowerLetter"/>
+      <w:lvlText w:val="%5."/>
+      <w:lvlJc w:val="left"/>
+      <w:pPr>
+        <w:ind w:left="3600" w:hanging="360"/>
+      </w:pPr>
+    </w:lvl>
+    <w:lvl w:ilvl="5" w:tplc="FFFFFFFF" w:tentative="1">
+      <w:start w:val="1"/>
+      <w:numFmt w:val="lowerRoman"/>
+      <w:lvlText w:val="%6."/>
+      <w:lvlJc w:val="right"/>
+      <w:pPr>
+        <w:ind w:left="4320" w:hanging="180"/>
+      </w:pPr>
+    </w:lvl>
+    <w:lvl w:ilvl="6" w:tplc="FFFFFFFF" w:tentative="1">
+      <w:start w:val="1"/>
+      <w:numFmt w:val="decimal"/>
+      <w:lvlText w:val="%7."/>
+      <w:lvlJc w:val="left"/>
+      <w:pPr>
+        <w:ind w:left="5040" w:hanging="360"/>
+      </w:pPr>
+    </w:lvl>
+    <w:lvl w:ilvl="7" w:tplc="FFFFFFFF" w:tentative="1">
+      <w:start w:val="1"/>
+      <w:numFmt w:val="lowerLetter"/>
+      <w:lvlText w:val="%8."/>
+      <w:lvlJc w:val="left"/>
+      <w:pPr>
+        <w:ind w:left="5760" w:hanging="360"/>
+      </w:pPr>
+    </w:lvl>
+    <w:lvl w:ilvl="8" w:tplc="FFFFFFFF" w:tentative="1">
+      <w:start w:val="1"/>
+      <w:numFmt w:val="lowerRoman"/>
+      <w:lvlText w:val="%9."/>
+      <w:lvlJc w:val="right"/>
+      <w:pPr>
+        <w:ind w:left="6480" w:hanging="180"/>
+      </w:pPr>
+    </w:lvl>
+  </w:abstractNum>
+  <w:abstractNum w:abstractNumId="9" w15:restartNumberingAfterBreak="0">
     <w:nsid w:val="51A14C7C"/>
     <w:multiLevelType w:val="hybridMultilevel"/>
     <w:tmpl w:val="66369978"/>
@@ -3332,7 +5411,96 @@
       </w:pPr>
     </w:lvl>
   </w:abstractNum>
-  <w:abstractNum w:abstractNumId="6" w15:restartNumberingAfterBreak="0">
+  <w:abstractNum w:abstractNumId="10" w15:restartNumberingAfterBreak="0">
+    <w:nsid w:val="6A97622F"/>
+    <w:multiLevelType w:val="hybridMultilevel"/>
+    <w:tmpl w:val="0554E344"/>
+    <w:lvl w:ilvl="0" w:tplc="0409000F">
+      <w:start w:val="1"/>
+      <w:numFmt w:val="decimal"/>
+      <w:lvlText w:val="%1."/>
+      <w:lvlJc w:val="left"/>
+      <w:pPr>
+        <w:ind w:left="720" w:hanging="360"/>
+      </w:pPr>
+      <w:rPr>
+        <w:rFonts w:hint="default"/>
+      </w:rPr>
+    </w:lvl>
+    <w:lvl w:ilvl="1" w:tplc="04090019" w:tentative="1">
+      <w:start w:val="1"/>
+      <w:numFmt w:val="lowerLetter"/>
+      <w:lvlText w:val="%2."/>
+      <w:lvlJc w:val="left"/>
+      <w:pPr>
+        <w:ind w:left="1440" w:hanging="360"/>
+      </w:pPr>
+    </w:lvl>
+    <w:lvl w:ilvl="2" w:tplc="0409001B" w:tentative="1">
+      <w:start w:val="1"/>
+      <w:numFmt w:val="lowerRoman"/>
+      <w:lvlText w:val="%3."/>
+      <w:lvlJc w:val="right"/>
+      <w:pPr>
+        <w:ind w:left="2160" w:hanging="180"/>
+      </w:pPr>
+    </w:lvl>
+    <w:lvl w:ilvl="3" w:tplc="0409000F" w:tentative="1">
+      <w:start w:val="1"/>
+      <w:numFmt w:val="decimal"/>
+      <w:lvlText w:val="%4."/>
+      <w:lvlJc w:val="left"/>
+      <w:pPr>
+        <w:ind w:left="2880" w:hanging="360"/>
+      </w:pPr>
+    </w:lvl>
+    <w:lvl w:ilvl="4" w:tplc="04090019" w:tentative="1">
+      <w:start w:val="1"/>
+      <w:numFmt w:val="lowerLetter"/>
+      <w:lvlText w:val="%5."/>
+      <w:lvlJc w:val="left"/>
+      <w:pPr>
+        <w:ind w:left="3600" w:hanging="360"/>
+      </w:pPr>
+    </w:lvl>
+    <w:lvl w:ilvl="5" w:tplc="0409001B" w:tentative="1">
+      <w:start w:val="1"/>
+      <w:numFmt w:val="lowerRoman"/>
+      <w:lvlText w:val="%6."/>
+      <w:lvlJc w:val="right"/>
+      <w:pPr>
+        <w:ind w:left="4320" w:hanging="180"/>
+      </w:pPr>
+    </w:lvl>
+    <w:lvl w:ilvl="6" w:tplc="0409000F" w:tentative="1">
+      <w:start w:val="1"/>
+      <w:numFmt w:val="decimal"/>
+      <w:lvlText w:val="%7."/>
+      <w:lvlJc w:val="left"/>
+      <w:pPr>
+        <w:ind w:left="5040" w:hanging="360"/>
+      </w:pPr>
+    </w:lvl>
+    <w:lvl w:ilvl="7" w:tplc="04090019" w:tentative="1">
+      <w:start w:val="1"/>
+      <w:numFmt w:val="lowerLetter"/>
+      <w:lvlText w:val="%8."/>
+      <w:lvlJc w:val="left"/>
+      <w:pPr>
+        <w:ind w:left="5760" w:hanging="360"/>
+      </w:pPr>
+    </w:lvl>
+    <w:lvl w:ilvl="8" w:tplc="0409001B" w:tentative="1">
+      <w:start w:val="1"/>
+      <w:numFmt w:val="lowerRoman"/>
+      <w:lvlText w:val="%9."/>
+      <w:lvlJc w:val="right"/>
+      <w:pPr>
+        <w:ind w:left="6480" w:hanging="180"/>
+      </w:pPr>
+    </w:lvl>
+  </w:abstractNum>
+  <w:abstractNum w:abstractNumId="11" w15:restartNumberingAfterBreak="0">
     <w:nsid w:val="70FA7CD4"/>
     <w:multiLevelType w:val="hybridMultilevel"/>
     <w:tmpl w:val="83060348"/>
@@ -3421,7 +5589,7 @@
       </w:pPr>
     </w:lvl>
   </w:abstractNum>
-  <w:abstractNum w:abstractNumId="7" w15:restartNumberingAfterBreak="0">
+  <w:abstractNum w:abstractNumId="12" w15:restartNumberingAfterBreak="0">
     <w:nsid w:val="72C42566"/>
     <w:multiLevelType w:val="hybridMultilevel"/>
     <w:tmpl w:val="2A3A7B54"/>
@@ -3510,7 +5678,7 @@
       </w:pPr>
     </w:lvl>
   </w:abstractNum>
-  <w:abstractNum w:abstractNumId="8" w15:restartNumberingAfterBreak="0">
+  <w:abstractNum w:abstractNumId="13" w15:restartNumberingAfterBreak="0">
     <w:nsid w:val="7658540D"/>
     <w:multiLevelType w:val="hybridMultilevel"/>
     <w:tmpl w:val="65281AA4"/>
@@ -3599,7 +5767,7 @@
       </w:pPr>
     </w:lvl>
   </w:abstractNum>
-  <w:abstractNum w:abstractNumId="9" w15:restartNumberingAfterBreak="0">
+  <w:abstractNum w:abstractNumId="14" w15:restartNumberingAfterBreak="0">
     <w:nsid w:val="77303D7E"/>
     <w:multiLevelType w:val="hybridMultilevel"/>
     <w:tmpl w:val="26E6D25E"/>
@@ -3689,34 +5857,49 @@
     </w:lvl>
   </w:abstractNum>
   <w:num w:numId="1" w16cid:durableId="2094086331">
+    <w:abstractNumId w:val="6"/>
+  </w:num>
+  <w:num w:numId="2" w16cid:durableId="1645041956">
+    <w:abstractNumId w:val="1"/>
+  </w:num>
+  <w:num w:numId="3" w16cid:durableId="373388983">
+    <w:abstractNumId w:val="14"/>
+  </w:num>
+  <w:num w:numId="4" w16cid:durableId="1171915713">
+    <w:abstractNumId w:val="9"/>
+  </w:num>
+  <w:num w:numId="5" w16cid:durableId="1722167586">
+    <w:abstractNumId w:val="7"/>
+  </w:num>
+  <w:num w:numId="6" w16cid:durableId="1106580549">
+    <w:abstractNumId w:val="11"/>
+  </w:num>
+  <w:num w:numId="7" w16cid:durableId="738407106">
+    <w:abstractNumId w:val="4"/>
+  </w:num>
+  <w:num w:numId="8" w16cid:durableId="352877418">
     <w:abstractNumId w:val="3"/>
   </w:num>
-  <w:num w:numId="2" w16cid:durableId="1645041956">
-    <w:abstractNumId w:val="0"/>
+  <w:num w:numId="9" w16cid:durableId="8919422">
+    <w:abstractNumId w:val="13"/>
   </w:num>
-  <w:num w:numId="3" w16cid:durableId="373388983">
-    <w:abstractNumId w:val="9"/>
+  <w:num w:numId="10" w16cid:durableId="883836582">
+    <w:abstractNumId w:val="12"/>
   </w:num>
-  <w:num w:numId="4" w16cid:durableId="1171915713">
+  <w:num w:numId="11" w16cid:durableId="129984092">
+    <w:abstractNumId w:val="8"/>
+  </w:num>
+  <w:num w:numId="12" w16cid:durableId="1710909419">
+    <w:abstractNumId w:val="10"/>
+  </w:num>
+  <w:num w:numId="13" w16cid:durableId="388267173">
     <w:abstractNumId w:val="5"/>
   </w:num>
-  <w:num w:numId="5" w16cid:durableId="1722167586">
-    <w:abstractNumId w:val="4"/>
-  </w:num>
-  <w:num w:numId="6" w16cid:durableId="1106580549">
-    <w:abstractNumId w:val="6"/>
-  </w:num>
-  <w:num w:numId="7" w16cid:durableId="738407106">
+  <w:num w:numId="14" w16cid:durableId="225728587">
     <w:abstractNumId w:val="2"/>
   </w:num>
-  <w:num w:numId="8" w16cid:durableId="352877418">
-    <w:abstractNumId w:val="1"/>
-  </w:num>
-  <w:num w:numId="9" w16cid:durableId="8919422">
-    <w:abstractNumId w:val="8"/>
-  </w:num>
-  <w:num w:numId="10" w16cid:durableId="883836582">
-    <w:abstractNumId w:val="7"/>
+  <w:num w:numId="15" w16cid:durableId="579142505">
+    <w:abstractNumId w:val="0"/>
   </w:num>
 </w:numbering>
 </file>

</xml_diff>